<commit_message>
feat: invitation opens the respondent's own WhatsApp chat and carries the study contact line
- POST /invitations/ returns whatsapp_to / whatsapp_to_name (eligible respondent first,
  one normalised number); Send via WhatsApp opens that chat and says who it is, or that
  no number is on file
- Invitation message ends with 'Questions: Happyson Saina, 0773943709,
  abffst.research.cut@gmail.com' (PI-approved amendment, 16 Sep 2026; recorded in docs/31)
- Manuals and docs/29 updated; finalise_manuals.ps1 skips a PDF that is open in a viewer

Co-Authored-By: Claude Opus 5 <noreply@anthropic.com>
</commit_message>
<xml_diff>
--- a/docs/manuals/Respondent_Guide.docx
+++ b/docs/manuals/Respondent_Guide.docx
@@ -69,7 +69,7 @@
           <w:left w:w="10" w:type="dxa"/>
           <w:right w:w="10" w:type="dxa"/>
         </w:tblCellMar>
-        <w:tblLook w:val="04A0" w:firstRow="1" w:lastRow="0" w:firstColumn="1" w:lastColumn="0" w:noHBand="0" w:noVBand="1"/>
+        <w:tblLook w:val="0000" w:firstRow="0" w:lastRow="0" w:firstColumn="0" w:lastColumn="0" w:noHBand="0" w:noVBand="0"/>
       </w:tblPr>
       <w:tblGrid>
         <w:gridCol w:w="2300"/>
@@ -538,7 +538,7 @@
     <w:sdt>
       <w:sdtPr>
         <w:alias w:val="Contents"/>
-        <w:id w:val="-1753805953"/>
+        <w:id w:val="892083369"/>
       </w:sdtPr>
       <w:sdtEndPr/>
       <w:sdtContent>
@@ -567,7 +567,7 @@
           <w:r>
             <w:fldChar w:fldCharType="separate"/>
           </w:r>
-          <w:hyperlink w:anchor="_Toc240405781" w:history="1">
+          <w:hyperlink w:anchor="_Toc240453414" w:history="1">
             <w:r>
               <w:rPr>
                 <w:rStyle w:val="Hyperlink"/>
@@ -591,7 +591,7 @@
               <w:rPr>
                 <w:noProof/>
               </w:rPr>
-              <w:instrText xml:space="preserve"> PAGEREF _Toc240405781 \h </w:instrText>
+              <w:instrText xml:space="preserve"> PAGEREF _Toc240453414 \h </w:instrText>
             </w:r>
             <w:r>
               <w:rPr>
@@ -634,7 +634,7 @@
               <w14:ligatures w14:val="standardContextual"/>
             </w:rPr>
           </w:pPr>
-          <w:hyperlink w:anchor="_Toc240405782" w:history="1">
+          <w:hyperlink w:anchor="_Toc240453415" w:history="1">
             <w:r>
               <w:rPr>
                 <w:rStyle w:val="Hyperlink"/>
@@ -658,7 +658,7 @@
               <w:rPr>
                 <w:noProof/>
               </w:rPr>
-              <w:instrText xml:space="preserve"> PAGEREF _Toc240405782 \h </w:instrText>
+              <w:instrText xml:space="preserve"> PAGEREF _Toc240453415 \h </w:instrText>
             </w:r>
             <w:r>
               <w:rPr>
@@ -701,7 +701,7 @@
               <w14:ligatures w14:val="standardContextual"/>
             </w:rPr>
           </w:pPr>
-          <w:hyperlink w:anchor="_Toc240405783" w:history="1">
+          <w:hyperlink w:anchor="_Toc240453416" w:history="1">
             <w:r>
               <w:rPr>
                 <w:rStyle w:val="Hyperlink"/>
@@ -725,7 +725,7 @@
               <w:rPr>
                 <w:noProof/>
               </w:rPr>
-              <w:instrText xml:space="preserve"> PAGEREF _Toc240405783 \h </w:instrText>
+              <w:instrText xml:space="preserve"> PAGEREF _Toc240453416 \h </w:instrText>
             </w:r>
             <w:r>
               <w:rPr>
@@ -768,7 +768,7 @@
               <w14:ligatures w14:val="standardContextual"/>
             </w:rPr>
           </w:pPr>
-          <w:hyperlink w:anchor="_Toc240405784" w:history="1">
+          <w:hyperlink w:anchor="_Toc240453417" w:history="1">
             <w:r>
               <w:rPr>
                 <w:rStyle w:val="Hyperlink"/>
@@ -792,7 +792,7 @@
               <w:rPr>
                 <w:noProof/>
               </w:rPr>
-              <w:instrText xml:space="preserve"> PAGEREF _Toc240405784 \h </w:instrText>
+              <w:instrText xml:space="preserve"> PAGEREF _Toc240453417 \h </w:instrText>
             </w:r>
             <w:r>
               <w:rPr>
@@ -835,7 +835,7 @@
               <w14:ligatures w14:val="standardContextual"/>
             </w:rPr>
           </w:pPr>
-          <w:hyperlink w:anchor="_Toc240405785" w:history="1">
+          <w:hyperlink w:anchor="_Toc240453418" w:history="1">
             <w:r>
               <w:rPr>
                 <w:rStyle w:val="Hyperlink"/>
@@ -859,7 +859,7 @@
               <w:rPr>
                 <w:noProof/>
               </w:rPr>
-              <w:instrText xml:space="preserve"> PAGEREF _Toc240405785 \h </w:instrText>
+              <w:instrText xml:space="preserve"> PAGEREF _Toc240453418 \h </w:instrText>
             </w:r>
             <w:r>
               <w:rPr>
@@ -902,7 +902,7 @@
               <w14:ligatures w14:val="standardContextual"/>
             </w:rPr>
           </w:pPr>
-          <w:hyperlink w:anchor="_Toc240405786" w:history="1">
+          <w:hyperlink w:anchor="_Toc240453419" w:history="1">
             <w:r>
               <w:rPr>
                 <w:rStyle w:val="Hyperlink"/>
@@ -926,7 +926,7 @@
               <w:rPr>
                 <w:noProof/>
               </w:rPr>
-              <w:instrText xml:space="preserve"> PAGEREF _Toc240405786 \h </w:instrText>
+              <w:instrText xml:space="preserve"> PAGEREF _Toc240453419 \h </w:instrText>
             </w:r>
             <w:r>
               <w:rPr>
@@ -969,7 +969,7 @@
               <w14:ligatures w14:val="standardContextual"/>
             </w:rPr>
           </w:pPr>
-          <w:hyperlink w:anchor="_Toc240405787" w:history="1">
+          <w:hyperlink w:anchor="_Toc240453420" w:history="1">
             <w:r>
               <w:rPr>
                 <w:rStyle w:val="Hyperlink"/>
@@ -993,7 +993,7 @@
               <w:rPr>
                 <w:noProof/>
               </w:rPr>
-              <w:instrText xml:space="preserve"> PAGEREF _Toc240405787 \h </w:instrText>
+              <w:instrText xml:space="preserve"> PAGEREF _Toc240453420 \h </w:instrText>
             </w:r>
             <w:r>
               <w:rPr>
@@ -1036,7 +1036,7 @@
               <w14:ligatures w14:val="standardContextual"/>
             </w:rPr>
           </w:pPr>
-          <w:hyperlink w:anchor="_Toc240405788" w:history="1">
+          <w:hyperlink w:anchor="_Toc240453421" w:history="1">
             <w:r>
               <w:rPr>
                 <w:rStyle w:val="Hyperlink"/>
@@ -1060,7 +1060,7 @@
               <w:rPr>
                 <w:noProof/>
               </w:rPr>
-              <w:instrText xml:space="preserve"> PAGEREF _Toc240405788 \h </w:instrText>
+              <w:instrText xml:space="preserve"> PAGEREF _Toc240453421 \h </w:instrText>
             </w:r>
             <w:r>
               <w:rPr>
@@ -1103,7 +1103,7 @@
               <w14:ligatures w14:val="standardContextual"/>
             </w:rPr>
           </w:pPr>
-          <w:hyperlink w:anchor="_Toc240405789" w:history="1">
+          <w:hyperlink w:anchor="_Toc240453422" w:history="1">
             <w:r>
               <w:rPr>
                 <w:rStyle w:val="Hyperlink"/>
@@ -1127,7 +1127,7 @@
               <w:rPr>
                 <w:noProof/>
               </w:rPr>
-              <w:instrText xml:space="preserve"> PAGEREF _Toc240405789 \h </w:instrText>
+              <w:instrText xml:space="preserve"> PAGEREF _Toc240453422 \h </w:instrText>
             </w:r>
             <w:r>
               <w:rPr>
@@ -1170,7 +1170,7 @@
               <w14:ligatures w14:val="standardContextual"/>
             </w:rPr>
           </w:pPr>
-          <w:hyperlink w:anchor="_Toc240405790" w:history="1">
+          <w:hyperlink w:anchor="_Toc240453423" w:history="1">
             <w:r>
               <w:rPr>
                 <w:rStyle w:val="Hyperlink"/>
@@ -1194,7 +1194,7 @@
               <w:rPr>
                 <w:noProof/>
               </w:rPr>
-              <w:instrText xml:space="preserve"> PAGEREF _Toc240405790 \h </w:instrText>
+              <w:instrText xml:space="preserve"> PAGEREF _Toc240453423 \h </w:instrText>
             </w:r>
             <w:r>
               <w:rPr>
@@ -1237,7 +1237,7 @@
               <w14:ligatures w14:val="standardContextual"/>
             </w:rPr>
           </w:pPr>
-          <w:hyperlink w:anchor="_Toc240405791" w:history="1">
+          <w:hyperlink w:anchor="_Toc240453424" w:history="1">
             <w:r>
               <w:rPr>
                 <w:rStyle w:val="Hyperlink"/>
@@ -1261,7 +1261,7 @@
               <w:rPr>
                 <w:noProof/>
               </w:rPr>
-              <w:instrText xml:space="preserve"> PAGEREF _Toc240405791 \h </w:instrText>
+              <w:instrText xml:space="preserve"> PAGEREF _Toc240453424 \h </w:instrText>
             </w:r>
             <w:r>
               <w:rPr>
@@ -1304,7 +1304,7 @@
               <w14:ligatures w14:val="standardContextual"/>
             </w:rPr>
           </w:pPr>
-          <w:hyperlink w:anchor="_Toc240405792" w:history="1">
+          <w:hyperlink w:anchor="_Toc240453425" w:history="1">
             <w:r>
               <w:rPr>
                 <w:rStyle w:val="Hyperlink"/>
@@ -1328,7 +1328,7 @@
               <w:rPr>
                 <w:noProof/>
               </w:rPr>
-              <w:instrText xml:space="preserve"> PAGEREF _Toc240405792 \h </w:instrText>
+              <w:instrText xml:space="preserve"> PAGEREF _Toc240453425 \h </w:instrText>
             </w:r>
             <w:r>
               <w:rPr>
@@ -1371,7 +1371,7 @@
               <w14:ligatures w14:val="standardContextual"/>
             </w:rPr>
           </w:pPr>
-          <w:hyperlink w:anchor="_Toc240405793" w:history="1">
+          <w:hyperlink w:anchor="_Toc240453426" w:history="1">
             <w:r>
               <w:rPr>
                 <w:rStyle w:val="Hyperlink"/>
@@ -1395,7 +1395,7 @@
               <w:rPr>
                 <w:noProof/>
               </w:rPr>
-              <w:instrText xml:space="preserve"> PAGEREF _Toc240405793 \h </w:instrText>
+              <w:instrText xml:space="preserve"> PAGEREF _Toc240453426 \h </w:instrText>
             </w:r>
             <w:r>
               <w:rPr>
@@ -1438,7 +1438,7 @@
               <w14:ligatures w14:val="standardContextual"/>
             </w:rPr>
           </w:pPr>
-          <w:hyperlink w:anchor="_Toc240405794" w:history="1">
+          <w:hyperlink w:anchor="_Toc240453427" w:history="1">
             <w:r>
               <w:rPr>
                 <w:rStyle w:val="Hyperlink"/>
@@ -1462,7 +1462,7 @@
               <w:rPr>
                 <w:noProof/>
               </w:rPr>
-              <w:instrText xml:space="preserve"> PAGEREF _Toc240405794 \h </w:instrText>
+              <w:instrText xml:space="preserve"> PAGEREF _Toc240453427 \h </w:instrText>
             </w:r>
             <w:r>
               <w:rPr>
@@ -1505,7 +1505,7 @@
               <w14:ligatures w14:val="standardContextual"/>
             </w:rPr>
           </w:pPr>
-          <w:hyperlink w:anchor="_Toc240405795" w:history="1">
+          <w:hyperlink w:anchor="_Toc240453428" w:history="1">
             <w:r>
               <w:rPr>
                 <w:rStyle w:val="Hyperlink"/>
@@ -1529,7 +1529,7 @@
               <w:rPr>
                 <w:noProof/>
               </w:rPr>
-              <w:instrText xml:space="preserve"> PAGEREF _Toc240405795 \h </w:instrText>
+              <w:instrText xml:space="preserve"> PAGEREF _Toc240453428 \h </w:instrText>
             </w:r>
             <w:r>
               <w:rPr>
@@ -1572,7 +1572,7 @@
               <w14:ligatures w14:val="standardContextual"/>
             </w:rPr>
           </w:pPr>
-          <w:hyperlink w:anchor="_Toc240405796" w:history="1">
+          <w:hyperlink w:anchor="_Toc240453429" w:history="1">
             <w:r>
               <w:rPr>
                 <w:rStyle w:val="Hyperlink"/>
@@ -1596,7 +1596,7 @@
               <w:rPr>
                 <w:noProof/>
               </w:rPr>
-              <w:instrText xml:space="preserve"> PAGEREF _Toc240405796 \h </w:instrText>
+              <w:instrText xml:space="preserve"> PAGEREF _Toc240453429 \h </w:instrText>
             </w:r>
             <w:r>
               <w:rPr>
@@ -1639,7 +1639,7 @@
               <w14:ligatures w14:val="standardContextual"/>
             </w:rPr>
           </w:pPr>
-          <w:hyperlink w:anchor="_Toc240405797" w:history="1">
+          <w:hyperlink w:anchor="_Toc240453430" w:history="1">
             <w:r>
               <w:rPr>
                 <w:rStyle w:val="Hyperlink"/>
@@ -1663,7 +1663,7 @@
               <w:rPr>
                 <w:noProof/>
               </w:rPr>
-              <w:instrText xml:space="preserve"> PAGEREF _Toc240405797 \h </w:instrText>
+              <w:instrText xml:space="preserve"> PAGEREF _Toc240453430 \h </w:instrText>
             </w:r>
             <w:r>
               <w:rPr>
@@ -1706,7 +1706,7 @@
               <w14:ligatures w14:val="standardContextual"/>
             </w:rPr>
           </w:pPr>
-          <w:hyperlink w:anchor="_Toc240405798" w:history="1">
+          <w:hyperlink w:anchor="_Toc240453431" w:history="1">
             <w:r>
               <w:rPr>
                 <w:rStyle w:val="Hyperlink"/>
@@ -1730,7 +1730,7 @@
               <w:rPr>
                 <w:noProof/>
               </w:rPr>
-              <w:instrText xml:space="preserve"> PAGEREF _Toc240405798 \h </w:instrText>
+              <w:instrText xml:space="preserve"> PAGEREF _Toc240453431 \h </w:instrText>
             </w:r>
             <w:r>
               <w:rPr>
@@ -1769,7 +1769,7 @@
         <w:pStyle w:val="Heading1"/>
         <w:pageBreakBefore/>
       </w:pPr>
-      <w:bookmarkStart w:id="0" w:name="_Toc240405781"/>
+      <w:bookmarkStart w:id="0" w:name="_Toc240453414"/>
       <w:r>
         <w:lastRenderedPageBreak/>
         <w:t>1. Welcome</w:t>
@@ -1809,7 +1809,7 @@
           <w:left w:w="10" w:type="dxa"/>
           <w:right w:w="10" w:type="dxa"/>
         </w:tblCellMar>
-        <w:tblLook w:val="04A0" w:firstRow="1" w:lastRow="0" w:firstColumn="1" w:lastColumn="0" w:noHBand="0" w:noVBand="1"/>
+        <w:tblLook w:val="0000" w:firstRow="0" w:lastRow="0" w:firstColumn="0" w:lastColumn="0" w:noHBand="0" w:noVBand="0"/>
       </w:tblPr>
       <w:tblGrid>
         <w:gridCol w:w="2824"/>
@@ -2185,7 +2185,7 @@
       <w:pPr>
         <w:pStyle w:val="Heading2"/>
       </w:pPr>
-      <w:bookmarkStart w:id="1" w:name="_Toc240405782"/>
+      <w:bookmarkStart w:id="1" w:name="_Toc240453415"/>
       <w:r>
         <w:t>What you should know first</w:t>
       </w:r>
@@ -2303,7 +2303,7 @@
         <w:pStyle w:val="Heading1"/>
         <w:pageBreakBefore/>
       </w:pPr>
-      <w:bookmarkStart w:id="2" w:name="_Toc240405783"/>
+      <w:bookmarkStart w:id="2" w:name="_Toc240453416"/>
       <w:r>
         <w:lastRenderedPageBreak/>
         <w:t>2. What you need</w:t>
@@ -2399,7 +2399,7 @@
           <w:left w:w="10" w:type="dxa"/>
           <w:right w:w="10" w:type="dxa"/>
         </w:tblCellMar>
-        <w:tblLook w:val="04A0" w:firstRow="1" w:lastRow="0" w:firstColumn="1" w:lastColumn="0" w:noHBand="0" w:noVBand="1"/>
+        <w:tblLook w:val="0000" w:firstRow="0" w:lastRow="0" w:firstColumn="0" w:lastColumn="0" w:noHBand="0" w:noVBand="0"/>
       </w:tblPr>
       <w:tblGrid>
         <w:gridCol w:w="9412"/>
@@ -2532,7 +2532,7 @@
         <w:pStyle w:val="Heading1"/>
         <w:pageBreakBefore/>
       </w:pPr>
-      <w:bookmarkStart w:id="3" w:name="_Toc240405784"/>
+      <w:bookmarkStart w:id="3" w:name="_Toc240453417"/>
       <w:r>
         <w:lastRenderedPageBreak/>
         <w:t>3. Taking part, step by step</w:t>
@@ -2543,7 +2543,7 @@
       <w:pPr>
         <w:pStyle w:val="Heading2"/>
       </w:pPr>
-      <w:bookmarkStart w:id="4" w:name="_Toc240405785"/>
+      <w:bookmarkStart w:id="4" w:name="_Toc240453418"/>
       <w:r>
         <w:t>Step 1 — Open your link</w:t>
       </w:r>
@@ -2561,7 +2561,7 @@
       <w:pPr>
         <w:pStyle w:val="Heading2"/>
       </w:pPr>
-      <w:bookmarkStart w:id="5" w:name="_Toc240405786"/>
+      <w:bookmarkStart w:id="5" w:name="_Toc240453419"/>
       <w:r>
         <w:t>Step 2 — Confirm your organisation</w:t>
       </w:r>
@@ -2596,7 +2596,7 @@
           <w:noProof/>
         </w:rPr>
         <w:drawing>
-          <wp:inline distT="0" distB="0" distL="0" distR="0">
+          <wp:inline distT="0" distB="0" distL="0" distR="0" wp14:anchorId="307CE716" wp14:editId="42BA121B">
             <wp:extent cx="2476500" cy="3362325"/>
             <wp:effectExtent l="0" t="0" r="0" b="0"/>
             <wp:docPr id="1" name="resp_01_confirm.jpg" descr="Confirming the organisation." title="Confirming the organisation."/>
@@ -2665,7 +2665,7 @@
       <w:pPr>
         <w:pStyle w:val="Heading2"/>
       </w:pPr>
-      <w:bookmarkStart w:id="6" w:name="_Toc240405787"/>
+      <w:bookmarkStart w:id="6" w:name="_Toc240453420"/>
       <w:r>
         <w:t>Step 3 — Tell us a little about you</w:t>
       </w:r>
@@ -2757,7 +2757,7 @@
         </w:rPr>
         <w:lastRenderedPageBreak/>
         <w:drawing>
-          <wp:inline distT="0" distB="0" distL="0" distR="0">
+          <wp:inline distT="0" distB="0" distL="0" distR="0" wp14:anchorId="77556AD9" wp14:editId="22F10D41">
             <wp:extent cx="2476500" cy="3362325"/>
             <wp:effectExtent l="0" t="0" r="0" b="0"/>
             <wp:docPr id="2" name="resp_02_eligibility.jpg" descr="A little about you." title="A little about you."/>
@@ -2837,7 +2837,7 @@
           <w:left w:w="10" w:type="dxa"/>
           <w:right w:w="10" w:type="dxa"/>
         </w:tblCellMar>
-        <w:tblLook w:val="04A0" w:firstRow="1" w:lastRow="0" w:firstColumn="1" w:lastColumn="0" w:noHBand="0" w:noVBand="1"/>
+        <w:tblLook w:val="0000" w:firstRow="0" w:lastRow="0" w:firstColumn="0" w:lastColumn="0" w:noHBand="0" w:noVBand="0"/>
       </w:tblPr>
       <w:tblGrid>
         <w:gridCol w:w="9412"/>
@@ -2912,7 +2912,7 @@
       <w:pPr>
         <w:pStyle w:val="Heading2"/>
       </w:pPr>
-      <w:bookmarkStart w:id="7" w:name="_Toc240405788"/>
+      <w:bookmarkStart w:id="7" w:name="_Toc240453421"/>
       <w:r>
         <w:t>Step 4 — Read the participant information</w:t>
       </w:r>
@@ -2958,7 +2958,7 @@
         </w:rPr>
         <w:lastRenderedPageBreak/>
         <w:drawing>
-          <wp:inline distT="0" distB="0" distL="0" distR="0">
+          <wp:inline distT="0" distB="0" distL="0" distR="0" wp14:anchorId="14964B5C" wp14:editId="64D5CC9B">
             <wp:extent cx="1076325" cy="4953000"/>
             <wp:effectExtent l="0" t="0" r="0" b="0"/>
             <wp:docPr id="3" name="resp_03_information_top.jpg" descr="Participant Information." title="Participant Information."/>
@@ -3027,7 +3027,7 @@
       <w:pPr>
         <w:pStyle w:val="Heading2"/>
       </w:pPr>
-      <w:bookmarkStart w:id="8" w:name="_Toc240405789"/>
+      <w:bookmarkStart w:id="8" w:name="_Toc240453422"/>
       <w:r>
         <w:t>Step 5 — Give your decision</w:t>
       </w:r>
@@ -3119,7 +3119,7 @@
         </w:rPr>
         <w:lastRenderedPageBreak/>
         <w:drawing>
-          <wp:inline distT="0" distB="0" distL="0" distR="0">
+          <wp:inline distT="0" distB="0" distL="0" distR="0" wp14:anchorId="79173B62" wp14:editId="0B4E2015">
             <wp:extent cx="2476500" cy="4419600"/>
             <wp:effectExtent l="0" t="0" r="0" b="0"/>
             <wp:docPr id="4" name="resp_04_consent.jpg" descr="Your consent." title="Your consent."/>
@@ -3188,7 +3188,7 @@
       <w:pPr>
         <w:pStyle w:val="Heading2"/>
       </w:pPr>
-      <w:bookmarkStart w:id="9" w:name="_Toc240405790"/>
+      <w:bookmarkStart w:id="9" w:name="_Toc240453423"/>
       <w:r>
         <w:t>Step 6 — Check what we already know (only if shown)</w:t>
       </w:r>
@@ -3276,7 +3276,7 @@
       <w:pPr>
         <w:pStyle w:val="Heading2"/>
       </w:pPr>
-      <w:bookmarkStart w:id="10" w:name="_Toc240405791"/>
+      <w:bookmarkStart w:id="10" w:name="_Toc240453424"/>
       <w:r>
         <w:t>Step 7 — Choose how you would like to take part</w:t>
       </w:r>
@@ -3297,7 +3297,7 @@
           <w:left w:w="10" w:type="dxa"/>
           <w:right w:w="10" w:type="dxa"/>
         </w:tblCellMar>
-        <w:tblLook w:val="04A0" w:firstRow="1" w:lastRow="0" w:firstColumn="1" w:lastColumn="0" w:noHBand="0" w:noVBand="1"/>
+        <w:tblLook w:val="0000" w:firstRow="0" w:lastRow="0" w:firstColumn="0" w:lastColumn="0" w:noHBand="0" w:noVBand="0"/>
       </w:tblPr>
       <w:tblGrid>
         <w:gridCol w:w="3577"/>
@@ -3618,7 +3618,7 @@
         </w:rPr>
         <w:lastRenderedPageBreak/>
         <w:drawing>
-          <wp:inline distT="0" distB="0" distL="0" distR="0">
+          <wp:inline distT="0" distB="0" distL="0" distR="0" wp14:anchorId="4F31744F" wp14:editId="3747DAC2">
             <wp:extent cx="2476500" cy="4533900"/>
             <wp:effectExtent l="0" t="0" r="0" b="0"/>
             <wp:docPr id="5" name="resp_06_choice.jpg" descr="How would you like to take part?" title="How would you like to take part?"/>
@@ -3687,7 +3687,7 @@
       <w:pPr>
         <w:pStyle w:val="Heading2"/>
       </w:pPr>
-      <w:bookmarkStart w:id="11" w:name="_Toc240405792"/>
+      <w:bookmarkStart w:id="11" w:name="_Toc240453425"/>
       <w:r>
         <w:t>Step 8a — Complete the questionnaire yourself</w:t>
       </w:r>
@@ -3779,7 +3779,7 @@
         </w:rPr>
         <w:lastRenderedPageBreak/>
         <w:drawing>
-          <wp:inline distT="0" distB="0" distL="0" distR="0">
+          <wp:inline distT="0" distB="0" distL="0" distR="0" wp14:anchorId="5AA01912" wp14:editId="4AEEA426">
             <wp:extent cx="2476500" cy="3362325"/>
             <wp:effectExtent l="0" t="0" r="0" b="0"/>
             <wp:docPr id="6" name="resp_07_ready.jpg" descr="Ready to begin." title="Ready to begin."/>
@@ -3855,7 +3855,7 @@
           <w:noProof/>
         </w:rPr>
         <w:drawing>
-          <wp:inline distT="0" distB="0" distL="0" distR="0">
+          <wp:inline distT="0" distB="0" distL="0" distR="0" wp14:anchorId="401C3320" wp14:editId="14E22CFE">
             <wp:extent cx="2476500" cy="3362325"/>
             <wp:effectExtent l="0" t="0" r="0" b="0"/>
             <wp:docPr id="7" name="resp_07b_kobo_form.jpg" descr="The questionnaire's first page." title="The questionnaire's first page."/>
@@ -3935,7 +3935,7 @@
           <w:left w:w="10" w:type="dxa"/>
           <w:right w:w="10" w:type="dxa"/>
         </w:tblCellMar>
-        <w:tblLook w:val="04A0" w:firstRow="1" w:lastRow="0" w:firstColumn="1" w:lastColumn="0" w:noHBand="0" w:noVBand="1"/>
+        <w:tblLook w:val="0000" w:firstRow="0" w:lastRow="0" w:firstColumn="0" w:lastColumn="0" w:noHBand="0" w:noVBand="0"/>
       </w:tblPr>
       <w:tblGrid>
         <w:gridCol w:w="9412"/>
@@ -4050,7 +4050,7 @@
       <w:pPr>
         <w:pStyle w:val="Heading2"/>
       </w:pPr>
-      <w:bookmarkStart w:id="12" w:name="_Toc240405793"/>
+      <w:bookmarkStart w:id="12" w:name="_Toc240453426"/>
       <w:r>
         <w:t>Step 8b — Ask a researcher to call you</w:t>
       </w:r>
@@ -4142,7 +4142,7 @@
           <w:noProof/>
         </w:rPr>
         <w:drawing>
-          <wp:inline distT="0" distB="0" distL="0" distR="0">
+          <wp:inline distT="0" distB="0" distL="0" distR="0" wp14:anchorId="43E4C1FF" wp14:editId="39F3368B">
             <wp:extent cx="2476500" cy="3362325"/>
             <wp:effectExtent l="0" t="0" r="0" b="0"/>
             <wp:docPr id="8" name="resp_08_appointment.jpg" descr="Choosing a time for a call." title="Choosing a time for a call."/>
@@ -4218,7 +4218,7 @@
           <w:noProof/>
         </w:rPr>
         <w:drawing>
-          <wp:inline distT="0" distB="0" distL="0" distR="0">
+          <wp:inline distT="0" distB="0" distL="0" distR="0" wp14:anchorId="42804358" wp14:editId="4DA4606F">
             <wp:extent cx="2476500" cy="3676650"/>
             <wp:effectExtent l="0" t="0" r="0" b="0"/>
             <wp:docPr id="9" name="resp_09_done_appointment.jpg" descr="Your request has been sent." title="Your request has been sent."/>
@@ -4287,7 +4287,7 @@
       <w:pPr>
         <w:pStyle w:val="Heading2"/>
       </w:pPr>
-      <w:bookmarkStart w:id="13" w:name="_Toc240405794"/>
+      <w:bookmarkStart w:id="13" w:name="_Toc240453427"/>
       <w:r>
         <w:t>Step 9 — Finished</w:t>
       </w:r>
@@ -4306,7 +4306,7 @@
         <w:pStyle w:val="Heading1"/>
         <w:pageBreakBefore/>
       </w:pPr>
-      <w:bookmarkStart w:id="14" w:name="_Toc240405795"/>
+      <w:bookmarkStart w:id="14" w:name="_Toc240453428"/>
       <w:r>
         <w:lastRenderedPageBreak/>
         <w:t>4. Reminders</w:t>
@@ -4326,7 +4326,7 @@
         <w:pStyle w:val="Heading1"/>
         <w:pageBreakBefore/>
       </w:pPr>
-      <w:bookmarkStart w:id="15" w:name="_Toc240405796"/>
+      <w:bookmarkStart w:id="15" w:name="_Toc240453429"/>
       <w:r>
         <w:lastRenderedPageBreak/>
         <w:t>5. Your rights and your information</w:t>
@@ -4451,7 +4451,7 @@
         <w:pStyle w:val="Heading1"/>
         <w:pageBreakBefore/>
       </w:pPr>
-      <w:bookmarkStart w:id="16" w:name="_Toc240405797"/>
+      <w:bookmarkStart w:id="16" w:name="_Toc240453430"/>
       <w:r>
         <w:lastRenderedPageBreak/>
         <w:t>6. Questions and answers</w:t>
@@ -4473,7 +4473,7 @@
           <w:left w:w="10" w:type="dxa"/>
           <w:right w:w="10" w:type="dxa"/>
         </w:tblCellMar>
-        <w:tblLook w:val="04A0" w:firstRow="1" w:lastRow="0" w:firstColumn="1" w:lastColumn="0" w:noHBand="0" w:noVBand="1"/>
+        <w:tblLook w:val="0000" w:firstRow="0" w:lastRow="0" w:firstColumn="0" w:lastColumn="0" w:noHBand="0" w:noVBand="0"/>
       </w:tblPr>
       <w:tblGrid>
         <w:gridCol w:w="3388"/>
@@ -4966,7 +4966,7 @@
           <w:noProof/>
         </w:rPr>
         <w:drawing>
-          <wp:inline distT="0" distB="0" distL="0" distR="0">
+          <wp:inline distT="0" distB="0" distL="0" distR="0" wp14:anchorId="36145785" wp14:editId="456E50F3">
             <wp:extent cx="2476500" cy="2524125"/>
             <wp:effectExtent l="0" t="0" r="0" b="0"/>
             <wp:docPr id="10" name="resp_10_invalid_link.jpg" descr="What an invalid or expired link looks like." title="What an invalid or expired link looks like."/>
@@ -5036,7 +5036,7 @@
         <w:pStyle w:val="Heading1"/>
         <w:pageBreakBefore/>
       </w:pPr>
-      <w:bookmarkStart w:id="17" w:name="_Toc240405798"/>
+      <w:bookmarkStart w:id="17" w:name="_Toc240453431"/>
       <w:r>
         <w:lastRenderedPageBreak/>
         <w:t>7. Contact the research team</w:t>
@@ -5058,7 +5058,7 @@
           <w:left w:w="10" w:type="dxa"/>
           <w:right w:w="10" w:type="dxa"/>
         </w:tblCellMar>
-        <w:tblLook w:val="04A0" w:firstRow="1" w:lastRow="0" w:firstColumn="1" w:lastColumn="0" w:noHBand="0" w:noVBand="1"/>
+        <w:tblLook w:val="0000" w:firstRow="0" w:lastRow="0" w:firstColumn="0" w:lastColumn="0" w:noHBand="0" w:noVBand="0"/>
       </w:tblPr>
       <w:tblGrid>
         <w:gridCol w:w="2824"/>
@@ -5599,96 +5599,10 @@
 <file path=word/numbering.xml><?xml version="1.0" encoding="utf-8"?>
 <w:numbering xmlns:wpc="http://schemas.microsoft.com/office/word/2010/wordprocessingCanvas" xmlns:cx="http://schemas.microsoft.com/office/drawing/2014/chartex" xmlns:cx1="http://schemas.microsoft.com/office/drawing/2015/9/8/chartex" xmlns:cx2="http://schemas.microsoft.com/office/drawing/2015/10/21/chartex" xmlns:cx3="http://schemas.microsoft.com/office/drawing/2016/5/9/chartex" xmlns:cx4="http://schemas.microsoft.com/office/drawing/2016/5/10/chartex" xmlns:cx5="http://schemas.microsoft.com/office/drawing/2016/5/11/chartex" xmlns:cx6="http://schemas.microsoft.com/office/drawing/2016/5/12/chartex" xmlns:cx7="http://schemas.microsoft.com/office/drawing/2016/5/13/chartex" xmlns:cx8="http://schemas.microsoft.com/office/drawing/2016/5/14/chartex" xmlns:mc="http://schemas.openxmlformats.org/markup-compatibility/2006" xmlns:aink="http://schemas.microsoft.com/office/drawing/2016/ink" xmlns:am3d="http://schemas.microsoft.com/office/drawing/2017/model3d" xmlns:o="urn:schemas-microsoft-com:office:office" xmlns:oel="http://schemas.microsoft.com/office/2019/extlst" xmlns:r="http://schemas.openxmlformats.org/officeDocument/2006/relationships" xmlns:m="http://schemas.openxmlformats.org/officeDocument/2006/math" xmlns:v="urn:schemas-microsoft-com:vml" xmlns:wp14="http://schemas.microsoft.com/office/word/2010/wordprocessingDrawing" xmlns:wp="http://schemas.openxmlformats.org/drawingml/2006/wordprocessingDrawing" xmlns:w10="urn:schemas-microsoft-com:office:word" xmlns:w="http://schemas.openxmlformats.org/wordprocessingml/2006/main" xmlns:w14="http://schemas.microsoft.com/office/word/2010/wordml" xmlns:w15="http://schemas.microsoft.com/office/word/2012/wordml" xmlns:w16cex="http://schemas.microsoft.com/office/word/2018/wordml/cex" xmlns:w16cid="http://schemas.microsoft.com/office/word/2016/wordml/cid" xmlns:w16="http://schemas.microsoft.com/office/word/2018/wordml" xmlns:w16sdtdh="http://schemas.microsoft.com/office/word/2020/wordml/sdtdatahash" xmlns:w16se="http://schemas.microsoft.com/office/word/2015/wordml/symex" xmlns:wpg="http://schemas.microsoft.com/office/word/2010/wordprocessingGroup" xmlns:wpi="http://schemas.microsoft.com/office/word/2010/wordprocessingInk" xmlns:wne="http://schemas.microsoft.com/office/word/2006/wordml" xmlns:wps="http://schemas.microsoft.com/office/word/2010/wordprocessingShape" mc:Ignorable="w14 w15 w16se w16cid w16 w16cex w16sdtdh wp14">
   <w:abstractNum w:abstractNumId="0" w15:restartNumberingAfterBreak="0">
-    <w:nsid w:val="19FA392A"/>
+    <w:nsid w:val="173F7D1D"/>
     <w:multiLevelType w:val="hybridMultilevel"/>
-    <w:tmpl w:val="777EA4C0"/>
-    <w:lvl w:ilvl="0" w:tplc="01764BA6">
-      <w:start w:val="1"/>
-      <w:numFmt w:val="bullet"/>
-      <w:lvlText w:val="●"/>
-      <w:lvlJc w:val="left"/>
-      <w:pPr>
-        <w:ind w:left="720" w:hanging="360"/>
-      </w:pPr>
-    </w:lvl>
-    <w:lvl w:ilvl="1" w:tplc="A97EED1C">
-      <w:start w:val="1"/>
-      <w:numFmt w:val="bullet"/>
-      <w:lvlText w:val="○"/>
-      <w:lvlJc w:val="left"/>
-      <w:pPr>
-        <w:ind w:left="1440" w:hanging="360"/>
-      </w:pPr>
-    </w:lvl>
-    <w:lvl w:ilvl="2" w:tplc="D7381C80">
-      <w:start w:val="1"/>
-      <w:numFmt w:val="bullet"/>
-      <w:lvlText w:val="■"/>
-      <w:lvlJc w:val="left"/>
-      <w:pPr>
-        <w:ind w:left="2160" w:hanging="360"/>
-      </w:pPr>
-    </w:lvl>
-    <w:lvl w:ilvl="3" w:tplc="C9CC5154">
-      <w:start w:val="1"/>
-      <w:numFmt w:val="bullet"/>
-      <w:lvlText w:val="●"/>
-      <w:lvlJc w:val="left"/>
-      <w:pPr>
-        <w:ind w:left="2880" w:hanging="360"/>
-      </w:pPr>
-    </w:lvl>
-    <w:lvl w:ilvl="4" w:tplc="903AA8EA">
-      <w:start w:val="1"/>
-      <w:numFmt w:val="bullet"/>
-      <w:lvlText w:val="○"/>
-      <w:lvlJc w:val="left"/>
-      <w:pPr>
-        <w:ind w:left="3600" w:hanging="360"/>
-      </w:pPr>
-    </w:lvl>
-    <w:lvl w:ilvl="5" w:tplc="95B00E0E">
-      <w:start w:val="1"/>
-      <w:numFmt w:val="bullet"/>
-      <w:lvlText w:val="■"/>
-      <w:lvlJc w:val="left"/>
-      <w:pPr>
-        <w:ind w:left="4320" w:hanging="360"/>
-      </w:pPr>
-    </w:lvl>
-    <w:lvl w:ilvl="6" w:tplc="B2F28BCA">
-      <w:start w:val="1"/>
-      <w:numFmt w:val="bullet"/>
-      <w:lvlText w:val="●"/>
-      <w:lvlJc w:val="left"/>
-      <w:pPr>
-        <w:ind w:left="5040" w:hanging="360"/>
-      </w:pPr>
-    </w:lvl>
-    <w:lvl w:ilvl="7" w:tplc="5650998A">
-      <w:start w:val="1"/>
-      <w:numFmt w:val="bullet"/>
-      <w:lvlText w:val="●"/>
-      <w:lvlJc w:val="left"/>
-      <w:pPr>
-        <w:ind w:left="5760" w:hanging="360"/>
-      </w:pPr>
-    </w:lvl>
-    <w:lvl w:ilvl="8" w:tplc="BADE71D4">
-      <w:start w:val="1"/>
-      <w:numFmt w:val="bullet"/>
-      <w:lvlText w:val="●"/>
-      <w:lvlJc w:val="left"/>
-      <w:pPr>
-        <w:ind w:left="6480" w:hanging="360"/>
-      </w:pPr>
-    </w:lvl>
-  </w:abstractNum>
-  <w:abstractNum w:abstractNumId="1" w15:restartNumberingAfterBreak="0">
-    <w:nsid w:val="35F544A2"/>
-    <w:multiLevelType w:val="hybridMultilevel"/>
-    <w:tmpl w:val="89D4F324"/>
-    <w:lvl w:ilvl="0" w:tplc="41061978">
+    <w:tmpl w:val="0776B330"/>
+    <w:lvl w:ilvl="0" w:tplc="BD562BF2">
       <w:start w:val="1"/>
       <w:numFmt w:val="decimal"/>
       <w:lvlText w:val="%1."/>
@@ -5702,249 +5616,335 @@
         <w:color w:val="A67C27"/>
       </w:rPr>
     </w:lvl>
-    <w:lvl w:ilvl="1" w:tplc="7F88FE02">
+    <w:lvl w:ilvl="1" w:tplc="3D58A38C">
       <w:numFmt w:val="decimal"/>
       <w:lvlText w:val=""/>
       <w:lvlJc w:val="left"/>
     </w:lvl>
-    <w:lvl w:ilvl="2" w:tplc="1D7A4954">
+    <w:lvl w:ilvl="2" w:tplc="99BE9D0E">
       <w:numFmt w:val="decimal"/>
       <w:lvlText w:val=""/>
       <w:lvlJc w:val="left"/>
     </w:lvl>
-    <w:lvl w:ilvl="3" w:tplc="6C28BED4">
+    <w:lvl w:ilvl="3" w:tplc="8D846992">
       <w:numFmt w:val="decimal"/>
       <w:lvlText w:val=""/>
       <w:lvlJc w:val="left"/>
     </w:lvl>
-    <w:lvl w:ilvl="4" w:tplc="3C644E64">
+    <w:lvl w:ilvl="4" w:tplc="72688AC2">
       <w:numFmt w:val="decimal"/>
       <w:lvlText w:val=""/>
       <w:lvlJc w:val="left"/>
     </w:lvl>
-    <w:lvl w:ilvl="5" w:tplc="B3960A70">
+    <w:lvl w:ilvl="5" w:tplc="95EC0EF4">
       <w:numFmt w:val="decimal"/>
       <w:lvlText w:val=""/>
       <w:lvlJc w:val="left"/>
     </w:lvl>
-    <w:lvl w:ilvl="6" w:tplc="EBAA6CC4">
+    <w:lvl w:ilvl="6" w:tplc="E75EABB0">
       <w:numFmt w:val="decimal"/>
       <w:lvlText w:val=""/>
       <w:lvlJc w:val="left"/>
     </w:lvl>
-    <w:lvl w:ilvl="7" w:tplc="19206608">
+    <w:lvl w:ilvl="7" w:tplc="EFB6B3A4">
       <w:numFmt w:val="decimal"/>
       <w:lvlText w:val=""/>
       <w:lvlJc w:val="left"/>
     </w:lvl>
-    <w:lvl w:ilvl="8" w:tplc="B0D6A00E">
+    <w:lvl w:ilvl="8" w:tplc="141CD4B6">
+      <w:numFmt w:val="decimal"/>
+      <w:lvlText w:val=""/>
+      <w:lvlJc w:val="left"/>
+    </w:lvl>
+  </w:abstractNum>
+  <w:abstractNum w:abstractNumId="1" w15:restartNumberingAfterBreak="0">
+    <w:nsid w:val="261B0C15"/>
+    <w:multiLevelType w:val="hybridMultilevel"/>
+    <w:tmpl w:val="8CA2BE64"/>
+    <w:lvl w:ilvl="0" w:tplc="BA9A148A">
+      <w:start w:val="1"/>
+      <w:numFmt w:val="decimal"/>
+      <w:lvlText w:val="%1."/>
+      <w:lvlJc w:val="left"/>
+      <w:pPr>
+        <w:ind w:left="460" w:hanging="360"/>
+      </w:pPr>
+      <w:rPr>
+        <w:b/>
+        <w:bCs/>
+        <w:color w:val="A67C27"/>
+      </w:rPr>
+    </w:lvl>
+    <w:lvl w:ilvl="1" w:tplc="3FDE86B8">
+      <w:numFmt w:val="decimal"/>
+      <w:lvlText w:val=""/>
+      <w:lvlJc w:val="left"/>
+    </w:lvl>
+    <w:lvl w:ilvl="2" w:tplc="B4BAC4BC">
+      <w:numFmt w:val="decimal"/>
+      <w:lvlText w:val=""/>
+      <w:lvlJc w:val="left"/>
+    </w:lvl>
+    <w:lvl w:ilvl="3" w:tplc="1CE61ACE">
+      <w:numFmt w:val="decimal"/>
+      <w:lvlText w:val=""/>
+      <w:lvlJc w:val="left"/>
+    </w:lvl>
+    <w:lvl w:ilvl="4" w:tplc="935C971E">
+      <w:numFmt w:val="decimal"/>
+      <w:lvlText w:val=""/>
+      <w:lvlJc w:val="left"/>
+    </w:lvl>
+    <w:lvl w:ilvl="5" w:tplc="C4B6F248">
+      <w:numFmt w:val="decimal"/>
+      <w:lvlText w:val=""/>
+      <w:lvlJc w:val="left"/>
+    </w:lvl>
+    <w:lvl w:ilvl="6" w:tplc="3D98541A">
+      <w:numFmt w:val="decimal"/>
+      <w:lvlText w:val=""/>
+      <w:lvlJc w:val="left"/>
+    </w:lvl>
+    <w:lvl w:ilvl="7" w:tplc="BD8E7B78">
+      <w:numFmt w:val="decimal"/>
+      <w:lvlText w:val=""/>
+      <w:lvlJc w:val="left"/>
+    </w:lvl>
+    <w:lvl w:ilvl="8" w:tplc="43163130">
       <w:numFmt w:val="decimal"/>
       <w:lvlText w:val=""/>
       <w:lvlJc w:val="left"/>
     </w:lvl>
   </w:abstractNum>
   <w:abstractNum w:abstractNumId="2" w15:restartNumberingAfterBreak="0">
-    <w:nsid w:val="3AC84EBE"/>
+    <w:nsid w:val="4CE47B47"/>
     <w:multiLevelType w:val="hybridMultilevel"/>
-    <w:tmpl w:val="040C8FBC"/>
-    <w:lvl w:ilvl="0" w:tplc="C5EEED30">
+    <w:tmpl w:val="61B006F8"/>
+    <w:lvl w:ilvl="0" w:tplc="A5182BBE">
       <w:start w:val="1"/>
-      <w:numFmt w:val="bullet"/>
-      <w:lvlText w:val="•"/>
+      <w:numFmt w:val="decimal"/>
+      <w:lvlText w:val="%1."/>
       <w:lvlJc w:val="left"/>
       <w:pPr>
-        <w:ind w:left="460" w:hanging="280"/>
-      </w:pPr>
+        <w:ind w:left="460" w:hanging="360"/>
+      </w:pPr>
+      <w:rPr>
+        <w:b/>
+        <w:bCs/>
+        <w:color w:val="A67C27"/>
+      </w:rPr>
     </w:lvl>
-    <w:lvl w:ilvl="1" w:tplc="C846C308">
-      <w:start w:val="1"/>
-      <w:numFmt w:val="bullet"/>
-      <w:lvlText w:val="–"/>
-      <w:lvlJc w:val="left"/>
-      <w:pPr>
-        <w:ind w:left="900" w:hanging="280"/>
-      </w:pPr>
-    </w:lvl>
-    <w:lvl w:ilvl="2" w:tplc="A55A0B24">
+    <w:lvl w:ilvl="1" w:tplc="94889EFE">
       <w:numFmt w:val="decimal"/>
       <w:lvlText w:val=""/>
       <w:lvlJc w:val="left"/>
     </w:lvl>
-    <w:lvl w:ilvl="3" w:tplc="B154832C">
+    <w:lvl w:ilvl="2" w:tplc="E9BC80FC">
       <w:numFmt w:val="decimal"/>
       <w:lvlText w:val=""/>
       <w:lvlJc w:val="left"/>
     </w:lvl>
-    <w:lvl w:ilvl="4" w:tplc="D7521732">
+    <w:lvl w:ilvl="3" w:tplc="C914A6A0">
       <w:numFmt w:val="decimal"/>
       <w:lvlText w:val=""/>
       <w:lvlJc w:val="left"/>
     </w:lvl>
-    <w:lvl w:ilvl="5" w:tplc="30DE27CC">
+    <w:lvl w:ilvl="4" w:tplc="B6767E26">
       <w:numFmt w:val="decimal"/>
       <w:lvlText w:val=""/>
       <w:lvlJc w:val="left"/>
     </w:lvl>
-    <w:lvl w:ilvl="6" w:tplc="18524932">
+    <w:lvl w:ilvl="5" w:tplc="DE0CEC7A">
       <w:numFmt w:val="decimal"/>
       <w:lvlText w:val=""/>
       <w:lvlJc w:val="left"/>
     </w:lvl>
-    <w:lvl w:ilvl="7" w:tplc="98D4A6D6">
+    <w:lvl w:ilvl="6" w:tplc="C0A4D2CE">
       <w:numFmt w:val="decimal"/>
       <w:lvlText w:val=""/>
       <w:lvlJc w:val="left"/>
     </w:lvl>
-    <w:lvl w:ilvl="8" w:tplc="D9BA5F22">
+    <w:lvl w:ilvl="7" w:tplc="C7EC4CEC">
+      <w:numFmt w:val="decimal"/>
+      <w:lvlText w:val=""/>
+      <w:lvlJc w:val="left"/>
+    </w:lvl>
+    <w:lvl w:ilvl="8" w:tplc="49A26456">
       <w:numFmt w:val="decimal"/>
       <w:lvlText w:val=""/>
       <w:lvlJc w:val="left"/>
     </w:lvl>
   </w:abstractNum>
   <w:abstractNum w:abstractNumId="3" w15:restartNumberingAfterBreak="0">
-    <w:nsid w:val="5F2420AA"/>
+    <w:nsid w:val="51404356"/>
     <w:multiLevelType w:val="hybridMultilevel"/>
-    <w:tmpl w:val="B204F4F4"/>
-    <w:lvl w:ilvl="0" w:tplc="BA642C00">
+    <w:tmpl w:val="1EC85D08"/>
+    <w:lvl w:ilvl="0" w:tplc="88F83944">
       <w:start w:val="1"/>
-      <w:numFmt w:val="decimal"/>
-      <w:lvlText w:val="%1."/>
+      <w:numFmt w:val="bullet"/>
+      <w:lvlText w:val="•"/>
       <w:lvlJc w:val="left"/>
       <w:pPr>
-        <w:ind w:left="460" w:hanging="360"/>
-      </w:pPr>
-      <w:rPr>
-        <w:b/>
-        <w:bCs/>
-        <w:color w:val="A67C27"/>
-      </w:rPr>
+        <w:ind w:left="460" w:hanging="280"/>
+      </w:pPr>
     </w:lvl>
-    <w:lvl w:ilvl="1" w:tplc="594E5ECE">
+    <w:lvl w:ilvl="1" w:tplc="4CEEC3B6">
+      <w:start w:val="1"/>
+      <w:numFmt w:val="bullet"/>
+      <w:lvlText w:val="–"/>
+      <w:lvlJc w:val="left"/>
+      <w:pPr>
+        <w:ind w:left="900" w:hanging="280"/>
+      </w:pPr>
+    </w:lvl>
+    <w:lvl w:ilvl="2" w:tplc="B9267778">
       <w:numFmt w:val="decimal"/>
       <w:lvlText w:val=""/>
       <w:lvlJc w:val="left"/>
     </w:lvl>
-    <w:lvl w:ilvl="2" w:tplc="6CA0B25C">
+    <w:lvl w:ilvl="3" w:tplc="9DC4ECA4">
       <w:numFmt w:val="decimal"/>
       <w:lvlText w:val=""/>
       <w:lvlJc w:val="left"/>
     </w:lvl>
-    <w:lvl w:ilvl="3" w:tplc="0F8CE1EC">
+    <w:lvl w:ilvl="4" w:tplc="0BDA300C">
       <w:numFmt w:val="decimal"/>
       <w:lvlText w:val=""/>
       <w:lvlJc w:val="left"/>
     </w:lvl>
-    <w:lvl w:ilvl="4" w:tplc="DC8A24B8">
+    <w:lvl w:ilvl="5" w:tplc="81DE9596">
       <w:numFmt w:val="decimal"/>
       <w:lvlText w:val=""/>
       <w:lvlJc w:val="left"/>
     </w:lvl>
-    <w:lvl w:ilvl="5" w:tplc="0A2EF124">
+    <w:lvl w:ilvl="6" w:tplc="06123796">
       <w:numFmt w:val="decimal"/>
       <w:lvlText w:val=""/>
       <w:lvlJc w:val="left"/>
     </w:lvl>
-    <w:lvl w:ilvl="6" w:tplc="95521906">
+    <w:lvl w:ilvl="7" w:tplc="BDB4599E">
       <w:numFmt w:val="decimal"/>
       <w:lvlText w:val=""/>
       <w:lvlJc w:val="left"/>
     </w:lvl>
-    <w:lvl w:ilvl="7" w:tplc="7E76F76C">
-      <w:numFmt w:val="decimal"/>
-      <w:lvlText w:val=""/>
-      <w:lvlJc w:val="left"/>
-    </w:lvl>
-    <w:lvl w:ilvl="8" w:tplc="795882FE">
+    <w:lvl w:ilvl="8" w:tplc="63E82BBE">
       <w:numFmt w:val="decimal"/>
       <w:lvlText w:val=""/>
       <w:lvlJc w:val="left"/>
     </w:lvl>
   </w:abstractNum>
   <w:abstractNum w:abstractNumId="4" w15:restartNumberingAfterBreak="0">
-    <w:nsid w:val="7E6B31C2"/>
+    <w:nsid w:val="53244BE4"/>
     <w:multiLevelType w:val="hybridMultilevel"/>
-    <w:tmpl w:val="5DDC4998"/>
-    <w:lvl w:ilvl="0" w:tplc="AAD66C2E">
+    <w:tmpl w:val="76D8A7A6"/>
+    <w:lvl w:ilvl="0" w:tplc="28AEF7DA">
       <w:start w:val="1"/>
-      <w:numFmt w:val="decimal"/>
-      <w:lvlText w:val="%1."/>
+      <w:numFmt w:val="bullet"/>
+      <w:lvlText w:val="●"/>
       <w:lvlJc w:val="left"/>
       <w:pPr>
-        <w:ind w:left="460" w:hanging="360"/>
-      </w:pPr>
-      <w:rPr>
-        <w:b/>
-        <w:bCs/>
-        <w:color w:val="A67C27"/>
-      </w:rPr>
+        <w:ind w:left="720" w:hanging="360"/>
+      </w:pPr>
     </w:lvl>
-    <w:lvl w:ilvl="1" w:tplc="AE30E40E">
-      <w:numFmt w:val="decimal"/>
-      <w:lvlText w:val=""/>
+    <w:lvl w:ilvl="1" w:tplc="1442A74A">
+      <w:start w:val="1"/>
+      <w:numFmt w:val="bullet"/>
+      <w:lvlText w:val="○"/>
       <w:lvlJc w:val="left"/>
+      <w:pPr>
+        <w:ind w:left="1440" w:hanging="360"/>
+      </w:pPr>
     </w:lvl>
-    <w:lvl w:ilvl="2" w:tplc="6F825F68">
-      <w:numFmt w:val="decimal"/>
-      <w:lvlText w:val=""/>
+    <w:lvl w:ilvl="2" w:tplc="35FA3434">
+      <w:start w:val="1"/>
+      <w:numFmt w:val="bullet"/>
+      <w:lvlText w:val="■"/>
       <w:lvlJc w:val="left"/>
+      <w:pPr>
+        <w:ind w:left="2160" w:hanging="360"/>
+      </w:pPr>
     </w:lvl>
-    <w:lvl w:ilvl="3" w:tplc="7A4E70A4">
-      <w:numFmt w:val="decimal"/>
-      <w:lvlText w:val=""/>
+    <w:lvl w:ilvl="3" w:tplc="28CED90A">
+      <w:start w:val="1"/>
+      <w:numFmt w:val="bullet"/>
+      <w:lvlText w:val="●"/>
       <w:lvlJc w:val="left"/>
+      <w:pPr>
+        <w:ind w:left="2880" w:hanging="360"/>
+      </w:pPr>
     </w:lvl>
-    <w:lvl w:ilvl="4" w:tplc="AAE47EA4">
-      <w:numFmt w:val="decimal"/>
-      <w:lvlText w:val=""/>
+    <w:lvl w:ilvl="4" w:tplc="D72C4DB0">
+      <w:start w:val="1"/>
+      <w:numFmt w:val="bullet"/>
+      <w:lvlText w:val="○"/>
       <w:lvlJc w:val="left"/>
+      <w:pPr>
+        <w:ind w:left="3600" w:hanging="360"/>
+      </w:pPr>
     </w:lvl>
-    <w:lvl w:ilvl="5" w:tplc="C0064142">
-      <w:numFmt w:val="decimal"/>
-      <w:lvlText w:val=""/>
+    <w:lvl w:ilvl="5" w:tplc="A8E62044">
+      <w:start w:val="1"/>
+      <w:numFmt w:val="bullet"/>
+      <w:lvlText w:val="■"/>
       <w:lvlJc w:val="left"/>
+      <w:pPr>
+        <w:ind w:left="4320" w:hanging="360"/>
+      </w:pPr>
     </w:lvl>
-    <w:lvl w:ilvl="6" w:tplc="F12A99B8">
-      <w:numFmt w:val="decimal"/>
-      <w:lvlText w:val=""/>
+    <w:lvl w:ilvl="6" w:tplc="3A369188">
+      <w:start w:val="1"/>
+      <w:numFmt w:val="bullet"/>
+      <w:lvlText w:val="●"/>
       <w:lvlJc w:val="left"/>
+      <w:pPr>
+        <w:ind w:left="5040" w:hanging="360"/>
+      </w:pPr>
     </w:lvl>
-    <w:lvl w:ilvl="7" w:tplc="C3CCDA14">
-      <w:numFmt w:val="decimal"/>
-      <w:lvlText w:val=""/>
+    <w:lvl w:ilvl="7" w:tplc="79AC58D2">
+      <w:start w:val="1"/>
+      <w:numFmt w:val="bullet"/>
+      <w:lvlText w:val="●"/>
       <w:lvlJc w:val="left"/>
+      <w:pPr>
+        <w:ind w:left="5760" w:hanging="360"/>
+      </w:pPr>
     </w:lvl>
-    <w:lvl w:ilvl="8" w:tplc="ECAAC15C">
-      <w:numFmt w:val="decimal"/>
-      <w:lvlText w:val=""/>
+    <w:lvl w:ilvl="8" w:tplc="EAD801A6">
+      <w:start w:val="1"/>
+      <w:numFmt w:val="bullet"/>
+      <w:lvlText w:val="●"/>
       <w:lvlJc w:val="left"/>
+      <w:pPr>
+        <w:ind w:left="6480" w:hanging="360"/>
+      </w:pPr>
     </w:lvl>
   </w:abstractNum>
-  <w:num w:numId="1" w16cid:durableId="1640769110">
+  <w:num w:numId="1" w16cid:durableId="1026978365">
+    <w:abstractNumId w:val="4"/>
+    <w:lvlOverride w:ilvl="0">
+      <w:startOverride w:val="1"/>
+    </w:lvlOverride>
+  </w:num>
+  <w:num w:numId="2" w16cid:durableId="1819608044">
+    <w:abstractNumId w:val="3"/>
+    <w:lvlOverride w:ilvl="0">
+      <w:startOverride w:val="1"/>
+    </w:lvlOverride>
+  </w:num>
+  <w:num w:numId="3" w16cid:durableId="1827241220">
     <w:abstractNumId w:val="0"/>
     <w:lvlOverride w:ilvl="0">
       <w:startOverride w:val="1"/>
     </w:lvlOverride>
   </w:num>
-  <w:num w:numId="2" w16cid:durableId="1063990187">
-    <w:abstractNumId w:val="2"/>
-    <w:lvlOverride w:ilvl="0">
-      <w:startOverride w:val="1"/>
-    </w:lvlOverride>
-  </w:num>
-  <w:num w:numId="3" w16cid:durableId="910893617">
-    <w:abstractNumId w:val="3"/>
-    <w:lvlOverride w:ilvl="0">
-      <w:startOverride w:val="1"/>
-    </w:lvlOverride>
-  </w:num>
-  <w:num w:numId="4" w16cid:durableId="1548028823">
+  <w:num w:numId="4" w16cid:durableId="610864706">
     <w:abstractNumId w:val="1"/>
     <w:lvlOverride w:ilvl="0">
       <w:startOverride w:val="1"/>
     </w:lvlOverride>
   </w:num>
-  <w:num w:numId="5" w16cid:durableId="1728993003">
-    <w:abstractNumId w:val="4"/>
+  <w:num w:numId="5" w16cid:durableId="1337228825">
+    <w:abstractNumId w:val="2"/>
     <w:lvlOverride w:ilvl="0">
       <w:startOverride w:val="1"/>
     </w:lvlOverride>
@@ -6570,7 +6570,7 @@
     <w:autoRedefine/>
     <w:uiPriority w:val="39"/>
     <w:unhideWhenUsed/>
-    <w:rsid w:val="00F40F3D"/>
+    <w:rsid w:val="00E662BE"/>
     <w:pPr>
       <w:spacing w:after="100"/>
     </w:pPr>
@@ -6582,7 +6582,7 @@
     <w:autoRedefine/>
     <w:uiPriority w:val="39"/>
     <w:unhideWhenUsed/>
-    <w:rsid w:val="00F40F3D"/>
+    <w:rsid w:val="00E662BE"/>
     <w:pPr>
       <w:spacing w:after="100"/>
       <w:ind w:left="210"/>

</xml_diff>

<commit_message>
feat: invitations go out with a ready-written message on WhatsApp, SMS or email
- apps/invitations/messages.py writes the WhatsApp, SMS and email versions in one place:
  personal link, expiry, manual code and the study contact line
- POST /invitations/ returns the link (study domain only; localhost in DEBUG), the
  messages and each channel's recipient from the case's respondents
- POST /invitations/{id}/send-email/ emails the invitation from the study address to the
  respondent's email on file; the link and code must match the invitation's stored
  fingerprints, only open invitations can be sent, audited with the address masked
- Case page: WhatsApp / SMS / Email message tabs with a preview, Send via WhatsApp,
  Send by SMS, Email from study address, Open in email app, Copy message
- Manuals, docs/29 and README updated

Co-Authored-By: Claude Opus 5 <noreply@anthropic.com>
</commit_message>
<xml_diff>
--- a/docs/manuals/Respondent_Guide.docx
+++ b/docs/manuals/Respondent_Guide.docx
@@ -538,7 +538,7 @@
     <w:sdt>
       <w:sdtPr>
         <w:alias w:val="Contents"/>
-        <w:id w:val="892083369"/>
+        <w:id w:val="117197878"/>
       </w:sdtPr>
       <w:sdtEndPr/>
       <w:sdtContent>
@@ -567,7 +567,7 @@
           <w:r>
             <w:fldChar w:fldCharType="separate"/>
           </w:r>
-          <w:hyperlink w:anchor="_Toc240453414" w:history="1">
+          <w:hyperlink w:anchor="_Toc240455071" w:history="1">
             <w:r>
               <w:rPr>
                 <w:rStyle w:val="Hyperlink"/>
@@ -591,7 +591,7 @@
               <w:rPr>
                 <w:noProof/>
               </w:rPr>
-              <w:instrText xml:space="preserve"> PAGEREF _Toc240453414 \h </w:instrText>
+              <w:instrText xml:space="preserve"> PAGEREF _Toc240455071 \h </w:instrText>
             </w:r>
             <w:r>
               <w:rPr>
@@ -634,7 +634,7 @@
               <w14:ligatures w14:val="standardContextual"/>
             </w:rPr>
           </w:pPr>
-          <w:hyperlink w:anchor="_Toc240453415" w:history="1">
+          <w:hyperlink w:anchor="_Toc240455072" w:history="1">
             <w:r>
               <w:rPr>
                 <w:rStyle w:val="Hyperlink"/>
@@ -658,7 +658,7 @@
               <w:rPr>
                 <w:noProof/>
               </w:rPr>
-              <w:instrText xml:space="preserve"> PAGEREF _Toc240453415 \h </w:instrText>
+              <w:instrText xml:space="preserve"> PAGEREF _Toc240455072 \h </w:instrText>
             </w:r>
             <w:r>
               <w:rPr>
@@ -701,7 +701,7 @@
               <w14:ligatures w14:val="standardContextual"/>
             </w:rPr>
           </w:pPr>
-          <w:hyperlink w:anchor="_Toc240453416" w:history="1">
+          <w:hyperlink w:anchor="_Toc240455073" w:history="1">
             <w:r>
               <w:rPr>
                 <w:rStyle w:val="Hyperlink"/>
@@ -725,7 +725,7 @@
               <w:rPr>
                 <w:noProof/>
               </w:rPr>
-              <w:instrText xml:space="preserve"> PAGEREF _Toc240453416 \h </w:instrText>
+              <w:instrText xml:space="preserve"> PAGEREF _Toc240455073 \h </w:instrText>
             </w:r>
             <w:r>
               <w:rPr>
@@ -768,7 +768,7 @@
               <w14:ligatures w14:val="standardContextual"/>
             </w:rPr>
           </w:pPr>
-          <w:hyperlink w:anchor="_Toc240453417" w:history="1">
+          <w:hyperlink w:anchor="_Toc240455074" w:history="1">
             <w:r>
               <w:rPr>
                 <w:rStyle w:val="Hyperlink"/>
@@ -792,7 +792,7 @@
               <w:rPr>
                 <w:noProof/>
               </w:rPr>
-              <w:instrText xml:space="preserve"> PAGEREF _Toc240453417 \h </w:instrText>
+              <w:instrText xml:space="preserve"> PAGEREF _Toc240455074 \h </w:instrText>
             </w:r>
             <w:r>
               <w:rPr>
@@ -835,7 +835,7 @@
               <w14:ligatures w14:val="standardContextual"/>
             </w:rPr>
           </w:pPr>
-          <w:hyperlink w:anchor="_Toc240453418" w:history="1">
+          <w:hyperlink w:anchor="_Toc240455075" w:history="1">
             <w:r>
               <w:rPr>
                 <w:rStyle w:val="Hyperlink"/>
@@ -859,7 +859,7 @@
               <w:rPr>
                 <w:noProof/>
               </w:rPr>
-              <w:instrText xml:space="preserve"> PAGEREF _Toc240453418 \h </w:instrText>
+              <w:instrText xml:space="preserve"> PAGEREF _Toc240455075 \h </w:instrText>
             </w:r>
             <w:r>
               <w:rPr>
@@ -902,7 +902,7 @@
               <w14:ligatures w14:val="standardContextual"/>
             </w:rPr>
           </w:pPr>
-          <w:hyperlink w:anchor="_Toc240453419" w:history="1">
+          <w:hyperlink w:anchor="_Toc240455076" w:history="1">
             <w:r>
               <w:rPr>
                 <w:rStyle w:val="Hyperlink"/>
@@ -926,7 +926,7 @@
               <w:rPr>
                 <w:noProof/>
               </w:rPr>
-              <w:instrText xml:space="preserve"> PAGEREF _Toc240453419 \h </w:instrText>
+              <w:instrText xml:space="preserve"> PAGEREF _Toc240455076 \h </w:instrText>
             </w:r>
             <w:r>
               <w:rPr>
@@ -969,7 +969,7 @@
               <w14:ligatures w14:val="standardContextual"/>
             </w:rPr>
           </w:pPr>
-          <w:hyperlink w:anchor="_Toc240453420" w:history="1">
+          <w:hyperlink w:anchor="_Toc240455077" w:history="1">
             <w:r>
               <w:rPr>
                 <w:rStyle w:val="Hyperlink"/>
@@ -993,7 +993,7 @@
               <w:rPr>
                 <w:noProof/>
               </w:rPr>
-              <w:instrText xml:space="preserve"> PAGEREF _Toc240453420 \h </w:instrText>
+              <w:instrText xml:space="preserve"> PAGEREF _Toc240455077 \h </w:instrText>
             </w:r>
             <w:r>
               <w:rPr>
@@ -1036,7 +1036,7 @@
               <w14:ligatures w14:val="standardContextual"/>
             </w:rPr>
           </w:pPr>
-          <w:hyperlink w:anchor="_Toc240453421" w:history="1">
+          <w:hyperlink w:anchor="_Toc240455078" w:history="1">
             <w:r>
               <w:rPr>
                 <w:rStyle w:val="Hyperlink"/>
@@ -1060,7 +1060,7 @@
               <w:rPr>
                 <w:noProof/>
               </w:rPr>
-              <w:instrText xml:space="preserve"> PAGEREF _Toc240453421 \h </w:instrText>
+              <w:instrText xml:space="preserve"> PAGEREF _Toc240455078 \h </w:instrText>
             </w:r>
             <w:r>
               <w:rPr>
@@ -1103,7 +1103,7 @@
               <w14:ligatures w14:val="standardContextual"/>
             </w:rPr>
           </w:pPr>
-          <w:hyperlink w:anchor="_Toc240453422" w:history="1">
+          <w:hyperlink w:anchor="_Toc240455079" w:history="1">
             <w:r>
               <w:rPr>
                 <w:rStyle w:val="Hyperlink"/>
@@ -1127,7 +1127,7 @@
               <w:rPr>
                 <w:noProof/>
               </w:rPr>
-              <w:instrText xml:space="preserve"> PAGEREF _Toc240453422 \h </w:instrText>
+              <w:instrText xml:space="preserve"> PAGEREF _Toc240455079 \h </w:instrText>
             </w:r>
             <w:r>
               <w:rPr>
@@ -1170,7 +1170,7 @@
               <w14:ligatures w14:val="standardContextual"/>
             </w:rPr>
           </w:pPr>
-          <w:hyperlink w:anchor="_Toc240453423" w:history="1">
+          <w:hyperlink w:anchor="_Toc240455080" w:history="1">
             <w:r>
               <w:rPr>
                 <w:rStyle w:val="Hyperlink"/>
@@ -1194,7 +1194,7 @@
               <w:rPr>
                 <w:noProof/>
               </w:rPr>
-              <w:instrText xml:space="preserve"> PAGEREF _Toc240453423 \h </w:instrText>
+              <w:instrText xml:space="preserve"> PAGEREF _Toc240455080 \h </w:instrText>
             </w:r>
             <w:r>
               <w:rPr>
@@ -1237,7 +1237,7 @@
               <w14:ligatures w14:val="standardContextual"/>
             </w:rPr>
           </w:pPr>
-          <w:hyperlink w:anchor="_Toc240453424" w:history="1">
+          <w:hyperlink w:anchor="_Toc240455081" w:history="1">
             <w:r>
               <w:rPr>
                 <w:rStyle w:val="Hyperlink"/>
@@ -1261,7 +1261,7 @@
               <w:rPr>
                 <w:noProof/>
               </w:rPr>
-              <w:instrText xml:space="preserve"> PAGEREF _Toc240453424 \h </w:instrText>
+              <w:instrText xml:space="preserve"> PAGEREF _Toc240455081 \h </w:instrText>
             </w:r>
             <w:r>
               <w:rPr>
@@ -1304,7 +1304,7 @@
               <w14:ligatures w14:val="standardContextual"/>
             </w:rPr>
           </w:pPr>
-          <w:hyperlink w:anchor="_Toc240453425" w:history="1">
+          <w:hyperlink w:anchor="_Toc240455082" w:history="1">
             <w:r>
               <w:rPr>
                 <w:rStyle w:val="Hyperlink"/>
@@ -1328,7 +1328,7 @@
               <w:rPr>
                 <w:noProof/>
               </w:rPr>
-              <w:instrText xml:space="preserve"> PAGEREF _Toc240453425 \h </w:instrText>
+              <w:instrText xml:space="preserve"> PAGEREF _Toc240455082 \h </w:instrText>
             </w:r>
             <w:r>
               <w:rPr>
@@ -1371,7 +1371,7 @@
               <w14:ligatures w14:val="standardContextual"/>
             </w:rPr>
           </w:pPr>
-          <w:hyperlink w:anchor="_Toc240453426" w:history="1">
+          <w:hyperlink w:anchor="_Toc240455083" w:history="1">
             <w:r>
               <w:rPr>
                 <w:rStyle w:val="Hyperlink"/>
@@ -1395,7 +1395,7 @@
               <w:rPr>
                 <w:noProof/>
               </w:rPr>
-              <w:instrText xml:space="preserve"> PAGEREF _Toc240453426 \h </w:instrText>
+              <w:instrText xml:space="preserve"> PAGEREF _Toc240455083 \h </w:instrText>
             </w:r>
             <w:r>
               <w:rPr>
@@ -1438,7 +1438,7 @@
               <w14:ligatures w14:val="standardContextual"/>
             </w:rPr>
           </w:pPr>
-          <w:hyperlink w:anchor="_Toc240453427" w:history="1">
+          <w:hyperlink w:anchor="_Toc240455084" w:history="1">
             <w:r>
               <w:rPr>
                 <w:rStyle w:val="Hyperlink"/>
@@ -1462,7 +1462,7 @@
               <w:rPr>
                 <w:noProof/>
               </w:rPr>
-              <w:instrText xml:space="preserve"> PAGEREF _Toc240453427 \h </w:instrText>
+              <w:instrText xml:space="preserve"> PAGEREF _Toc240455084 \h </w:instrText>
             </w:r>
             <w:r>
               <w:rPr>
@@ -1505,7 +1505,7 @@
               <w14:ligatures w14:val="standardContextual"/>
             </w:rPr>
           </w:pPr>
-          <w:hyperlink w:anchor="_Toc240453428" w:history="1">
+          <w:hyperlink w:anchor="_Toc240455085" w:history="1">
             <w:r>
               <w:rPr>
                 <w:rStyle w:val="Hyperlink"/>
@@ -1529,7 +1529,7 @@
               <w:rPr>
                 <w:noProof/>
               </w:rPr>
-              <w:instrText xml:space="preserve"> PAGEREF _Toc240453428 \h </w:instrText>
+              <w:instrText xml:space="preserve"> PAGEREF _Toc240455085 \h </w:instrText>
             </w:r>
             <w:r>
               <w:rPr>
@@ -1572,7 +1572,7 @@
               <w14:ligatures w14:val="standardContextual"/>
             </w:rPr>
           </w:pPr>
-          <w:hyperlink w:anchor="_Toc240453429" w:history="1">
+          <w:hyperlink w:anchor="_Toc240455086" w:history="1">
             <w:r>
               <w:rPr>
                 <w:rStyle w:val="Hyperlink"/>
@@ -1596,7 +1596,7 @@
               <w:rPr>
                 <w:noProof/>
               </w:rPr>
-              <w:instrText xml:space="preserve"> PAGEREF _Toc240453429 \h </w:instrText>
+              <w:instrText xml:space="preserve"> PAGEREF _Toc240455086 \h </w:instrText>
             </w:r>
             <w:r>
               <w:rPr>
@@ -1639,7 +1639,7 @@
               <w14:ligatures w14:val="standardContextual"/>
             </w:rPr>
           </w:pPr>
-          <w:hyperlink w:anchor="_Toc240453430" w:history="1">
+          <w:hyperlink w:anchor="_Toc240455087" w:history="1">
             <w:r>
               <w:rPr>
                 <w:rStyle w:val="Hyperlink"/>
@@ -1663,7 +1663,7 @@
               <w:rPr>
                 <w:noProof/>
               </w:rPr>
-              <w:instrText xml:space="preserve"> PAGEREF _Toc240453430 \h </w:instrText>
+              <w:instrText xml:space="preserve"> PAGEREF _Toc240455087 \h </w:instrText>
             </w:r>
             <w:r>
               <w:rPr>
@@ -1706,7 +1706,7 @@
               <w14:ligatures w14:val="standardContextual"/>
             </w:rPr>
           </w:pPr>
-          <w:hyperlink w:anchor="_Toc240453431" w:history="1">
+          <w:hyperlink w:anchor="_Toc240455088" w:history="1">
             <w:r>
               <w:rPr>
                 <w:rStyle w:val="Hyperlink"/>
@@ -1730,7 +1730,7 @@
               <w:rPr>
                 <w:noProof/>
               </w:rPr>
-              <w:instrText xml:space="preserve"> PAGEREF _Toc240453431 \h </w:instrText>
+              <w:instrText xml:space="preserve"> PAGEREF _Toc240455088 \h </w:instrText>
             </w:r>
             <w:r>
               <w:rPr>
@@ -1769,7 +1769,7 @@
         <w:pStyle w:val="Heading1"/>
         <w:pageBreakBefore/>
       </w:pPr>
-      <w:bookmarkStart w:id="0" w:name="_Toc240453414"/>
+      <w:bookmarkStart w:id="0" w:name="_Toc240455071"/>
       <w:r>
         <w:lastRenderedPageBreak/>
         <w:t>1. Welcome</w:t>
@@ -2185,7 +2185,7 @@
       <w:pPr>
         <w:pStyle w:val="Heading2"/>
       </w:pPr>
-      <w:bookmarkStart w:id="1" w:name="_Toc240453415"/>
+      <w:bookmarkStart w:id="1" w:name="_Toc240455072"/>
       <w:r>
         <w:t>What you should know first</w:t>
       </w:r>
@@ -2303,7 +2303,7 @@
         <w:pStyle w:val="Heading1"/>
         <w:pageBreakBefore/>
       </w:pPr>
-      <w:bookmarkStart w:id="2" w:name="_Toc240453416"/>
+      <w:bookmarkStart w:id="2" w:name="_Toc240455073"/>
       <w:r>
         <w:lastRenderedPageBreak/>
         <w:t>2. What you need</w:t>
@@ -2532,7 +2532,7 @@
         <w:pStyle w:val="Heading1"/>
         <w:pageBreakBefore/>
       </w:pPr>
-      <w:bookmarkStart w:id="3" w:name="_Toc240453417"/>
+      <w:bookmarkStart w:id="3" w:name="_Toc240455074"/>
       <w:r>
         <w:lastRenderedPageBreak/>
         <w:t>3. Taking part, step by step</w:t>
@@ -2543,7 +2543,7 @@
       <w:pPr>
         <w:pStyle w:val="Heading2"/>
       </w:pPr>
-      <w:bookmarkStart w:id="4" w:name="_Toc240453418"/>
+      <w:bookmarkStart w:id="4" w:name="_Toc240455075"/>
       <w:r>
         <w:t>Step 1 — Open your link</w:t>
       </w:r>
@@ -2561,7 +2561,7 @@
       <w:pPr>
         <w:pStyle w:val="Heading2"/>
       </w:pPr>
-      <w:bookmarkStart w:id="5" w:name="_Toc240453419"/>
+      <w:bookmarkStart w:id="5" w:name="_Toc240455076"/>
       <w:r>
         <w:t>Step 2 — Confirm your organisation</w:t>
       </w:r>
@@ -2596,7 +2596,7 @@
           <w:noProof/>
         </w:rPr>
         <w:drawing>
-          <wp:inline distT="0" distB="0" distL="0" distR="0" wp14:anchorId="307CE716" wp14:editId="42BA121B">
+          <wp:inline distT="0" distB="0" distL="0" distR="0" wp14:anchorId="08EC997A" wp14:editId="77C89E6E">
             <wp:extent cx="2476500" cy="3362325"/>
             <wp:effectExtent l="0" t="0" r="0" b="0"/>
             <wp:docPr id="1" name="resp_01_confirm.jpg" descr="Confirming the organisation." title="Confirming the organisation."/>
@@ -2665,7 +2665,7 @@
       <w:pPr>
         <w:pStyle w:val="Heading2"/>
       </w:pPr>
-      <w:bookmarkStart w:id="6" w:name="_Toc240453420"/>
+      <w:bookmarkStart w:id="6" w:name="_Toc240455077"/>
       <w:r>
         <w:t>Step 3 — Tell us a little about you</w:t>
       </w:r>
@@ -2757,7 +2757,7 @@
         </w:rPr>
         <w:lastRenderedPageBreak/>
         <w:drawing>
-          <wp:inline distT="0" distB="0" distL="0" distR="0" wp14:anchorId="77556AD9" wp14:editId="22F10D41">
+          <wp:inline distT="0" distB="0" distL="0" distR="0" wp14:anchorId="6672DC3E" wp14:editId="5F782125">
             <wp:extent cx="2476500" cy="3362325"/>
             <wp:effectExtent l="0" t="0" r="0" b="0"/>
             <wp:docPr id="2" name="resp_02_eligibility.jpg" descr="A little about you." title="A little about you."/>
@@ -2912,7 +2912,7 @@
       <w:pPr>
         <w:pStyle w:val="Heading2"/>
       </w:pPr>
-      <w:bookmarkStart w:id="7" w:name="_Toc240453421"/>
+      <w:bookmarkStart w:id="7" w:name="_Toc240455078"/>
       <w:r>
         <w:t>Step 4 — Read the participant information</w:t>
       </w:r>
@@ -2958,7 +2958,7 @@
         </w:rPr>
         <w:lastRenderedPageBreak/>
         <w:drawing>
-          <wp:inline distT="0" distB="0" distL="0" distR="0" wp14:anchorId="14964B5C" wp14:editId="64D5CC9B">
+          <wp:inline distT="0" distB="0" distL="0" distR="0" wp14:anchorId="1E9C747E" wp14:editId="732DB666">
             <wp:extent cx="1076325" cy="4953000"/>
             <wp:effectExtent l="0" t="0" r="0" b="0"/>
             <wp:docPr id="3" name="resp_03_information_top.jpg" descr="Participant Information." title="Participant Information."/>
@@ -3027,7 +3027,7 @@
       <w:pPr>
         <w:pStyle w:val="Heading2"/>
       </w:pPr>
-      <w:bookmarkStart w:id="8" w:name="_Toc240453422"/>
+      <w:bookmarkStart w:id="8" w:name="_Toc240455079"/>
       <w:r>
         <w:t>Step 5 — Give your decision</w:t>
       </w:r>
@@ -3119,7 +3119,7 @@
         </w:rPr>
         <w:lastRenderedPageBreak/>
         <w:drawing>
-          <wp:inline distT="0" distB="0" distL="0" distR="0" wp14:anchorId="79173B62" wp14:editId="0B4E2015">
+          <wp:inline distT="0" distB="0" distL="0" distR="0" wp14:anchorId="3BBB62D6" wp14:editId="1ECB8848">
             <wp:extent cx="2476500" cy="4419600"/>
             <wp:effectExtent l="0" t="0" r="0" b="0"/>
             <wp:docPr id="4" name="resp_04_consent.jpg" descr="Your consent." title="Your consent."/>
@@ -3188,7 +3188,7 @@
       <w:pPr>
         <w:pStyle w:val="Heading2"/>
       </w:pPr>
-      <w:bookmarkStart w:id="9" w:name="_Toc240453423"/>
+      <w:bookmarkStart w:id="9" w:name="_Toc240455080"/>
       <w:r>
         <w:t>Step 6 — Check what we already know (only if shown)</w:t>
       </w:r>
@@ -3276,7 +3276,7 @@
       <w:pPr>
         <w:pStyle w:val="Heading2"/>
       </w:pPr>
-      <w:bookmarkStart w:id="10" w:name="_Toc240453424"/>
+      <w:bookmarkStart w:id="10" w:name="_Toc240455081"/>
       <w:r>
         <w:t>Step 7 — Choose how you would like to take part</w:t>
       </w:r>
@@ -3618,7 +3618,7 @@
         </w:rPr>
         <w:lastRenderedPageBreak/>
         <w:drawing>
-          <wp:inline distT="0" distB="0" distL="0" distR="0" wp14:anchorId="4F31744F" wp14:editId="3747DAC2">
+          <wp:inline distT="0" distB="0" distL="0" distR="0" wp14:anchorId="0137F226" wp14:editId="5A5153ED">
             <wp:extent cx="2476500" cy="4533900"/>
             <wp:effectExtent l="0" t="0" r="0" b="0"/>
             <wp:docPr id="5" name="resp_06_choice.jpg" descr="How would you like to take part?" title="How would you like to take part?"/>
@@ -3687,7 +3687,7 @@
       <w:pPr>
         <w:pStyle w:val="Heading2"/>
       </w:pPr>
-      <w:bookmarkStart w:id="11" w:name="_Toc240453425"/>
+      <w:bookmarkStart w:id="11" w:name="_Toc240455082"/>
       <w:r>
         <w:t>Step 8a — Complete the questionnaire yourself</w:t>
       </w:r>
@@ -3779,7 +3779,7 @@
         </w:rPr>
         <w:lastRenderedPageBreak/>
         <w:drawing>
-          <wp:inline distT="0" distB="0" distL="0" distR="0" wp14:anchorId="5AA01912" wp14:editId="4AEEA426">
+          <wp:inline distT="0" distB="0" distL="0" distR="0" wp14:anchorId="7D0D86CF" wp14:editId="0AF9A518">
             <wp:extent cx="2476500" cy="3362325"/>
             <wp:effectExtent l="0" t="0" r="0" b="0"/>
             <wp:docPr id="6" name="resp_07_ready.jpg" descr="Ready to begin." title="Ready to begin."/>
@@ -3855,7 +3855,7 @@
           <w:noProof/>
         </w:rPr>
         <w:drawing>
-          <wp:inline distT="0" distB="0" distL="0" distR="0" wp14:anchorId="401C3320" wp14:editId="14E22CFE">
+          <wp:inline distT="0" distB="0" distL="0" distR="0" wp14:anchorId="263F40CB" wp14:editId="63A572A0">
             <wp:extent cx="2476500" cy="3362325"/>
             <wp:effectExtent l="0" t="0" r="0" b="0"/>
             <wp:docPr id="7" name="resp_07b_kobo_form.jpg" descr="The questionnaire's first page." title="The questionnaire's first page."/>
@@ -4050,7 +4050,7 @@
       <w:pPr>
         <w:pStyle w:val="Heading2"/>
       </w:pPr>
-      <w:bookmarkStart w:id="12" w:name="_Toc240453426"/>
+      <w:bookmarkStart w:id="12" w:name="_Toc240455083"/>
       <w:r>
         <w:t>Step 8b — Ask a researcher to call you</w:t>
       </w:r>
@@ -4142,7 +4142,7 @@
           <w:noProof/>
         </w:rPr>
         <w:drawing>
-          <wp:inline distT="0" distB="0" distL="0" distR="0" wp14:anchorId="43E4C1FF" wp14:editId="39F3368B">
+          <wp:inline distT="0" distB="0" distL="0" distR="0" wp14:anchorId="5D2B5DE2" wp14:editId="63BD874F">
             <wp:extent cx="2476500" cy="3362325"/>
             <wp:effectExtent l="0" t="0" r="0" b="0"/>
             <wp:docPr id="8" name="resp_08_appointment.jpg" descr="Choosing a time for a call." title="Choosing a time for a call."/>
@@ -4218,7 +4218,7 @@
           <w:noProof/>
         </w:rPr>
         <w:drawing>
-          <wp:inline distT="0" distB="0" distL="0" distR="0" wp14:anchorId="42804358" wp14:editId="4DA4606F">
+          <wp:inline distT="0" distB="0" distL="0" distR="0" wp14:anchorId="78FCC43A" wp14:editId="1400DFCE">
             <wp:extent cx="2476500" cy="3676650"/>
             <wp:effectExtent l="0" t="0" r="0" b="0"/>
             <wp:docPr id="9" name="resp_09_done_appointment.jpg" descr="Your request has been sent." title="Your request has been sent."/>
@@ -4287,7 +4287,7 @@
       <w:pPr>
         <w:pStyle w:val="Heading2"/>
       </w:pPr>
-      <w:bookmarkStart w:id="13" w:name="_Toc240453427"/>
+      <w:bookmarkStart w:id="13" w:name="_Toc240455084"/>
       <w:r>
         <w:t>Step 9 — Finished</w:t>
       </w:r>
@@ -4306,7 +4306,7 @@
         <w:pStyle w:val="Heading1"/>
         <w:pageBreakBefore/>
       </w:pPr>
-      <w:bookmarkStart w:id="14" w:name="_Toc240453428"/>
+      <w:bookmarkStart w:id="14" w:name="_Toc240455085"/>
       <w:r>
         <w:lastRenderedPageBreak/>
         <w:t>4. Reminders</w:t>
@@ -4326,7 +4326,7 @@
         <w:pStyle w:val="Heading1"/>
         <w:pageBreakBefore/>
       </w:pPr>
-      <w:bookmarkStart w:id="15" w:name="_Toc240453429"/>
+      <w:bookmarkStart w:id="15" w:name="_Toc240455086"/>
       <w:r>
         <w:lastRenderedPageBreak/>
         <w:t>5. Your rights and your information</w:t>
@@ -4451,7 +4451,7 @@
         <w:pStyle w:val="Heading1"/>
         <w:pageBreakBefore/>
       </w:pPr>
-      <w:bookmarkStart w:id="16" w:name="_Toc240453430"/>
+      <w:bookmarkStart w:id="16" w:name="_Toc240455087"/>
       <w:r>
         <w:lastRenderedPageBreak/>
         <w:t>6. Questions and answers</w:t>
@@ -4966,7 +4966,7 @@
           <w:noProof/>
         </w:rPr>
         <w:drawing>
-          <wp:inline distT="0" distB="0" distL="0" distR="0" wp14:anchorId="36145785" wp14:editId="456E50F3">
+          <wp:inline distT="0" distB="0" distL="0" distR="0" wp14:anchorId="0096A9B2" wp14:editId="2EF8CC8F">
             <wp:extent cx="2476500" cy="2524125"/>
             <wp:effectExtent l="0" t="0" r="0" b="0"/>
             <wp:docPr id="10" name="resp_10_invalid_link.jpg" descr="What an invalid or expired link looks like." title="What an invalid or expired link looks like."/>
@@ -5036,7 +5036,7 @@
         <w:pStyle w:val="Heading1"/>
         <w:pageBreakBefore/>
       </w:pPr>
-      <w:bookmarkStart w:id="17" w:name="_Toc240453431"/>
+      <w:bookmarkStart w:id="17" w:name="_Toc240455088"/>
       <w:r>
         <w:lastRenderedPageBreak/>
         <w:t>7. Contact the research team</w:t>
@@ -5599,10 +5599,10 @@
 <file path=word/numbering.xml><?xml version="1.0" encoding="utf-8"?>
 <w:numbering xmlns:wpc="http://schemas.microsoft.com/office/word/2010/wordprocessingCanvas" xmlns:cx="http://schemas.microsoft.com/office/drawing/2014/chartex" xmlns:cx1="http://schemas.microsoft.com/office/drawing/2015/9/8/chartex" xmlns:cx2="http://schemas.microsoft.com/office/drawing/2015/10/21/chartex" xmlns:cx3="http://schemas.microsoft.com/office/drawing/2016/5/9/chartex" xmlns:cx4="http://schemas.microsoft.com/office/drawing/2016/5/10/chartex" xmlns:cx5="http://schemas.microsoft.com/office/drawing/2016/5/11/chartex" xmlns:cx6="http://schemas.microsoft.com/office/drawing/2016/5/12/chartex" xmlns:cx7="http://schemas.microsoft.com/office/drawing/2016/5/13/chartex" xmlns:cx8="http://schemas.microsoft.com/office/drawing/2016/5/14/chartex" xmlns:mc="http://schemas.openxmlformats.org/markup-compatibility/2006" xmlns:aink="http://schemas.microsoft.com/office/drawing/2016/ink" xmlns:am3d="http://schemas.microsoft.com/office/drawing/2017/model3d" xmlns:o="urn:schemas-microsoft-com:office:office" xmlns:oel="http://schemas.microsoft.com/office/2019/extlst" xmlns:r="http://schemas.openxmlformats.org/officeDocument/2006/relationships" xmlns:m="http://schemas.openxmlformats.org/officeDocument/2006/math" xmlns:v="urn:schemas-microsoft-com:vml" xmlns:wp14="http://schemas.microsoft.com/office/word/2010/wordprocessingDrawing" xmlns:wp="http://schemas.openxmlformats.org/drawingml/2006/wordprocessingDrawing" xmlns:w10="urn:schemas-microsoft-com:office:word" xmlns:w="http://schemas.openxmlformats.org/wordprocessingml/2006/main" xmlns:w14="http://schemas.microsoft.com/office/word/2010/wordml" xmlns:w15="http://schemas.microsoft.com/office/word/2012/wordml" xmlns:w16cex="http://schemas.microsoft.com/office/word/2018/wordml/cex" xmlns:w16cid="http://schemas.microsoft.com/office/word/2016/wordml/cid" xmlns:w16="http://schemas.microsoft.com/office/word/2018/wordml" xmlns:w16sdtdh="http://schemas.microsoft.com/office/word/2020/wordml/sdtdatahash" xmlns:w16se="http://schemas.microsoft.com/office/word/2015/wordml/symex" xmlns:wpg="http://schemas.microsoft.com/office/word/2010/wordprocessingGroup" xmlns:wpi="http://schemas.microsoft.com/office/word/2010/wordprocessingInk" xmlns:wne="http://schemas.microsoft.com/office/word/2006/wordml" xmlns:wps="http://schemas.microsoft.com/office/word/2010/wordprocessingShape" mc:Ignorable="w14 w15 w16se w16cid w16 w16cex w16sdtdh wp14">
   <w:abstractNum w:abstractNumId="0" w15:restartNumberingAfterBreak="0">
-    <w:nsid w:val="173F7D1D"/>
+    <w:nsid w:val="1E0134C5"/>
     <w:multiLevelType w:val="hybridMultilevel"/>
-    <w:tmpl w:val="0776B330"/>
-    <w:lvl w:ilvl="0" w:tplc="BD562BF2">
+    <w:tmpl w:val="2F46F2F4"/>
+    <w:lvl w:ilvl="0" w:tplc="19A2DE32">
       <w:start w:val="1"/>
       <w:numFmt w:val="decimal"/>
       <w:lvlText w:val="%1."/>
@@ -5616,52 +5616,138 @@
         <w:color w:val="A67C27"/>
       </w:rPr>
     </w:lvl>
-    <w:lvl w:ilvl="1" w:tplc="3D58A38C">
+    <w:lvl w:ilvl="1" w:tplc="AB8CB362">
       <w:numFmt w:val="decimal"/>
       <w:lvlText w:val=""/>
       <w:lvlJc w:val="left"/>
     </w:lvl>
-    <w:lvl w:ilvl="2" w:tplc="99BE9D0E">
+    <w:lvl w:ilvl="2" w:tplc="4C56D77C">
       <w:numFmt w:val="decimal"/>
       <w:lvlText w:val=""/>
       <w:lvlJc w:val="left"/>
     </w:lvl>
-    <w:lvl w:ilvl="3" w:tplc="8D846992">
+    <w:lvl w:ilvl="3" w:tplc="5DE8156A">
       <w:numFmt w:val="decimal"/>
       <w:lvlText w:val=""/>
       <w:lvlJc w:val="left"/>
     </w:lvl>
-    <w:lvl w:ilvl="4" w:tplc="72688AC2">
+    <w:lvl w:ilvl="4" w:tplc="D53E57CA">
       <w:numFmt w:val="decimal"/>
       <w:lvlText w:val=""/>
       <w:lvlJc w:val="left"/>
     </w:lvl>
-    <w:lvl w:ilvl="5" w:tplc="95EC0EF4">
+    <w:lvl w:ilvl="5" w:tplc="752A5334">
       <w:numFmt w:val="decimal"/>
       <w:lvlText w:val=""/>
       <w:lvlJc w:val="left"/>
     </w:lvl>
-    <w:lvl w:ilvl="6" w:tplc="E75EABB0">
+    <w:lvl w:ilvl="6" w:tplc="4176A3C0">
       <w:numFmt w:val="decimal"/>
       <w:lvlText w:val=""/>
       <w:lvlJc w:val="left"/>
     </w:lvl>
-    <w:lvl w:ilvl="7" w:tplc="EFB6B3A4">
+    <w:lvl w:ilvl="7" w:tplc="6B18F264">
       <w:numFmt w:val="decimal"/>
       <w:lvlText w:val=""/>
       <w:lvlJc w:val="left"/>
     </w:lvl>
-    <w:lvl w:ilvl="8" w:tplc="141CD4B6">
+    <w:lvl w:ilvl="8" w:tplc="6986D4DC">
       <w:numFmt w:val="decimal"/>
       <w:lvlText w:val=""/>
       <w:lvlJc w:val="left"/>
     </w:lvl>
   </w:abstractNum>
   <w:abstractNum w:abstractNumId="1" w15:restartNumberingAfterBreak="0">
-    <w:nsid w:val="261B0C15"/>
+    <w:nsid w:val="258357A0"/>
     <w:multiLevelType w:val="hybridMultilevel"/>
-    <w:tmpl w:val="8CA2BE64"/>
-    <w:lvl w:ilvl="0" w:tplc="BA9A148A">
+    <w:tmpl w:val="B6AC616A"/>
+    <w:lvl w:ilvl="0" w:tplc="BEE036AC">
+      <w:start w:val="1"/>
+      <w:numFmt w:val="bullet"/>
+      <w:lvlText w:val="●"/>
+      <w:lvlJc w:val="left"/>
+      <w:pPr>
+        <w:ind w:left="720" w:hanging="360"/>
+      </w:pPr>
+    </w:lvl>
+    <w:lvl w:ilvl="1" w:tplc="D8C22ED6">
+      <w:start w:val="1"/>
+      <w:numFmt w:val="bullet"/>
+      <w:lvlText w:val="○"/>
+      <w:lvlJc w:val="left"/>
+      <w:pPr>
+        <w:ind w:left="1440" w:hanging="360"/>
+      </w:pPr>
+    </w:lvl>
+    <w:lvl w:ilvl="2" w:tplc="4D62F9B2">
+      <w:start w:val="1"/>
+      <w:numFmt w:val="bullet"/>
+      <w:lvlText w:val="■"/>
+      <w:lvlJc w:val="left"/>
+      <w:pPr>
+        <w:ind w:left="2160" w:hanging="360"/>
+      </w:pPr>
+    </w:lvl>
+    <w:lvl w:ilvl="3" w:tplc="D6225F68">
+      <w:start w:val="1"/>
+      <w:numFmt w:val="bullet"/>
+      <w:lvlText w:val="●"/>
+      <w:lvlJc w:val="left"/>
+      <w:pPr>
+        <w:ind w:left="2880" w:hanging="360"/>
+      </w:pPr>
+    </w:lvl>
+    <w:lvl w:ilvl="4" w:tplc="76FC3EA8">
+      <w:start w:val="1"/>
+      <w:numFmt w:val="bullet"/>
+      <w:lvlText w:val="○"/>
+      <w:lvlJc w:val="left"/>
+      <w:pPr>
+        <w:ind w:left="3600" w:hanging="360"/>
+      </w:pPr>
+    </w:lvl>
+    <w:lvl w:ilvl="5" w:tplc="1062F76A">
+      <w:start w:val="1"/>
+      <w:numFmt w:val="bullet"/>
+      <w:lvlText w:val="■"/>
+      <w:lvlJc w:val="left"/>
+      <w:pPr>
+        <w:ind w:left="4320" w:hanging="360"/>
+      </w:pPr>
+    </w:lvl>
+    <w:lvl w:ilvl="6" w:tplc="324A8B08">
+      <w:start w:val="1"/>
+      <w:numFmt w:val="bullet"/>
+      <w:lvlText w:val="●"/>
+      <w:lvlJc w:val="left"/>
+      <w:pPr>
+        <w:ind w:left="5040" w:hanging="360"/>
+      </w:pPr>
+    </w:lvl>
+    <w:lvl w:ilvl="7" w:tplc="3A787204">
+      <w:start w:val="1"/>
+      <w:numFmt w:val="bullet"/>
+      <w:lvlText w:val="●"/>
+      <w:lvlJc w:val="left"/>
+      <w:pPr>
+        <w:ind w:left="5760" w:hanging="360"/>
+      </w:pPr>
+    </w:lvl>
+    <w:lvl w:ilvl="8" w:tplc="8B46739A">
+      <w:start w:val="1"/>
+      <w:numFmt w:val="bullet"/>
+      <w:lvlText w:val="●"/>
+      <w:lvlJc w:val="left"/>
+      <w:pPr>
+        <w:ind w:left="6480" w:hanging="360"/>
+      </w:pPr>
+    </w:lvl>
+  </w:abstractNum>
+  <w:abstractNum w:abstractNumId="2" w15:restartNumberingAfterBreak="0">
+    <w:nsid w:val="4F332D51"/>
+    <w:multiLevelType w:val="hybridMultilevel"/>
+    <w:tmpl w:val="782466F4"/>
+    <w:lvl w:ilvl="0" w:tplc="F72E68E2">
       <w:start w:val="1"/>
       <w:numFmt w:val="decimal"/>
       <w:lvlText w:val="%1."/>
@@ -5675,52 +5761,52 @@
         <w:color w:val="A67C27"/>
       </w:rPr>
     </w:lvl>
-    <w:lvl w:ilvl="1" w:tplc="3FDE86B8">
+    <w:lvl w:ilvl="1" w:tplc="284EBE2A">
       <w:numFmt w:val="decimal"/>
       <w:lvlText w:val=""/>
       <w:lvlJc w:val="left"/>
     </w:lvl>
-    <w:lvl w:ilvl="2" w:tplc="B4BAC4BC">
+    <w:lvl w:ilvl="2" w:tplc="F2AC5CD8">
       <w:numFmt w:val="decimal"/>
       <w:lvlText w:val=""/>
       <w:lvlJc w:val="left"/>
     </w:lvl>
-    <w:lvl w:ilvl="3" w:tplc="1CE61ACE">
+    <w:lvl w:ilvl="3" w:tplc="47FCEA40">
       <w:numFmt w:val="decimal"/>
       <w:lvlText w:val=""/>
       <w:lvlJc w:val="left"/>
     </w:lvl>
-    <w:lvl w:ilvl="4" w:tplc="935C971E">
+    <w:lvl w:ilvl="4" w:tplc="3E1C16FE">
       <w:numFmt w:val="decimal"/>
       <w:lvlText w:val=""/>
       <w:lvlJc w:val="left"/>
     </w:lvl>
-    <w:lvl w:ilvl="5" w:tplc="C4B6F248">
+    <w:lvl w:ilvl="5" w:tplc="91F86B88">
       <w:numFmt w:val="decimal"/>
       <w:lvlText w:val=""/>
       <w:lvlJc w:val="left"/>
     </w:lvl>
-    <w:lvl w:ilvl="6" w:tplc="3D98541A">
+    <w:lvl w:ilvl="6" w:tplc="B25CEC7C">
       <w:numFmt w:val="decimal"/>
       <w:lvlText w:val=""/>
       <w:lvlJc w:val="left"/>
     </w:lvl>
-    <w:lvl w:ilvl="7" w:tplc="BD8E7B78">
+    <w:lvl w:ilvl="7" w:tplc="177A083C">
       <w:numFmt w:val="decimal"/>
       <w:lvlText w:val=""/>
       <w:lvlJc w:val="left"/>
     </w:lvl>
-    <w:lvl w:ilvl="8" w:tplc="43163130">
+    <w:lvl w:ilvl="8" w:tplc="60BC611C">
       <w:numFmt w:val="decimal"/>
       <w:lvlText w:val=""/>
       <w:lvlJc w:val="left"/>
     </w:lvl>
   </w:abstractNum>
-  <w:abstractNum w:abstractNumId="2" w15:restartNumberingAfterBreak="0">
-    <w:nsid w:val="4CE47B47"/>
+  <w:abstractNum w:abstractNumId="3" w15:restartNumberingAfterBreak="0">
+    <w:nsid w:val="6E8406D8"/>
     <w:multiLevelType w:val="hybridMultilevel"/>
-    <w:tmpl w:val="61B006F8"/>
-    <w:lvl w:ilvl="0" w:tplc="A5182BBE">
+    <w:tmpl w:val="7B201C94"/>
+    <w:lvl w:ilvl="0" w:tplc="D486DB02">
       <w:start w:val="1"/>
       <w:numFmt w:val="decimal"/>
       <w:lvlText w:val="%1."/>
@@ -5734,216 +5820,130 @@
         <w:color w:val="A67C27"/>
       </w:rPr>
     </w:lvl>
-    <w:lvl w:ilvl="1" w:tplc="94889EFE">
+    <w:lvl w:ilvl="1" w:tplc="914A3208">
       <w:numFmt w:val="decimal"/>
       <w:lvlText w:val=""/>
       <w:lvlJc w:val="left"/>
     </w:lvl>
-    <w:lvl w:ilvl="2" w:tplc="E9BC80FC">
+    <w:lvl w:ilvl="2" w:tplc="CBAC3252">
       <w:numFmt w:val="decimal"/>
       <w:lvlText w:val=""/>
       <w:lvlJc w:val="left"/>
     </w:lvl>
-    <w:lvl w:ilvl="3" w:tplc="C914A6A0">
+    <w:lvl w:ilvl="3" w:tplc="CA5251A0">
       <w:numFmt w:val="decimal"/>
       <w:lvlText w:val=""/>
       <w:lvlJc w:val="left"/>
     </w:lvl>
-    <w:lvl w:ilvl="4" w:tplc="B6767E26">
+    <w:lvl w:ilvl="4" w:tplc="B97070A2">
       <w:numFmt w:val="decimal"/>
       <w:lvlText w:val=""/>
       <w:lvlJc w:val="left"/>
     </w:lvl>
-    <w:lvl w:ilvl="5" w:tplc="DE0CEC7A">
+    <w:lvl w:ilvl="5" w:tplc="90AEEB3A">
       <w:numFmt w:val="decimal"/>
       <w:lvlText w:val=""/>
       <w:lvlJc w:val="left"/>
     </w:lvl>
-    <w:lvl w:ilvl="6" w:tplc="C0A4D2CE">
+    <w:lvl w:ilvl="6" w:tplc="D166B2BA">
       <w:numFmt w:val="decimal"/>
       <w:lvlText w:val=""/>
       <w:lvlJc w:val="left"/>
     </w:lvl>
-    <w:lvl w:ilvl="7" w:tplc="C7EC4CEC">
+    <w:lvl w:ilvl="7" w:tplc="1AD6EB6C">
       <w:numFmt w:val="decimal"/>
       <w:lvlText w:val=""/>
       <w:lvlJc w:val="left"/>
     </w:lvl>
-    <w:lvl w:ilvl="8" w:tplc="49A26456">
-      <w:numFmt w:val="decimal"/>
-      <w:lvlText w:val=""/>
-      <w:lvlJc w:val="left"/>
-    </w:lvl>
-  </w:abstractNum>
-  <w:abstractNum w:abstractNumId="3" w15:restartNumberingAfterBreak="0">
-    <w:nsid w:val="51404356"/>
-    <w:multiLevelType w:val="hybridMultilevel"/>
-    <w:tmpl w:val="1EC85D08"/>
-    <w:lvl w:ilvl="0" w:tplc="88F83944">
-      <w:start w:val="1"/>
-      <w:numFmt w:val="bullet"/>
-      <w:lvlText w:val="•"/>
-      <w:lvlJc w:val="left"/>
-      <w:pPr>
-        <w:ind w:left="460" w:hanging="280"/>
-      </w:pPr>
-    </w:lvl>
-    <w:lvl w:ilvl="1" w:tplc="4CEEC3B6">
-      <w:start w:val="1"/>
-      <w:numFmt w:val="bullet"/>
-      <w:lvlText w:val="–"/>
-      <w:lvlJc w:val="left"/>
-      <w:pPr>
-        <w:ind w:left="900" w:hanging="280"/>
-      </w:pPr>
-    </w:lvl>
-    <w:lvl w:ilvl="2" w:tplc="B9267778">
-      <w:numFmt w:val="decimal"/>
-      <w:lvlText w:val=""/>
-      <w:lvlJc w:val="left"/>
-    </w:lvl>
-    <w:lvl w:ilvl="3" w:tplc="9DC4ECA4">
-      <w:numFmt w:val="decimal"/>
-      <w:lvlText w:val=""/>
-      <w:lvlJc w:val="left"/>
-    </w:lvl>
-    <w:lvl w:ilvl="4" w:tplc="0BDA300C">
-      <w:numFmt w:val="decimal"/>
-      <w:lvlText w:val=""/>
-      <w:lvlJc w:val="left"/>
-    </w:lvl>
-    <w:lvl w:ilvl="5" w:tplc="81DE9596">
-      <w:numFmt w:val="decimal"/>
-      <w:lvlText w:val=""/>
-      <w:lvlJc w:val="left"/>
-    </w:lvl>
-    <w:lvl w:ilvl="6" w:tplc="06123796">
-      <w:numFmt w:val="decimal"/>
-      <w:lvlText w:val=""/>
-      <w:lvlJc w:val="left"/>
-    </w:lvl>
-    <w:lvl w:ilvl="7" w:tplc="BDB4599E">
-      <w:numFmt w:val="decimal"/>
-      <w:lvlText w:val=""/>
-      <w:lvlJc w:val="left"/>
-    </w:lvl>
-    <w:lvl w:ilvl="8" w:tplc="63E82BBE">
+    <w:lvl w:ilvl="8" w:tplc="361E83DC">
       <w:numFmt w:val="decimal"/>
       <w:lvlText w:val=""/>
       <w:lvlJc w:val="left"/>
     </w:lvl>
   </w:abstractNum>
   <w:abstractNum w:abstractNumId="4" w15:restartNumberingAfterBreak="0">
-    <w:nsid w:val="53244BE4"/>
+    <w:nsid w:val="71CC6E68"/>
     <w:multiLevelType w:val="hybridMultilevel"/>
-    <w:tmpl w:val="76D8A7A6"/>
-    <w:lvl w:ilvl="0" w:tplc="28AEF7DA">
+    <w:tmpl w:val="C3204E5C"/>
+    <w:lvl w:ilvl="0" w:tplc="98D25C56">
       <w:start w:val="1"/>
       <w:numFmt w:val="bullet"/>
-      <w:lvlText w:val="●"/>
+      <w:lvlText w:val="•"/>
       <w:lvlJc w:val="left"/>
       <w:pPr>
-        <w:ind w:left="720" w:hanging="360"/>
+        <w:ind w:left="460" w:hanging="280"/>
       </w:pPr>
     </w:lvl>
-    <w:lvl w:ilvl="1" w:tplc="1442A74A">
+    <w:lvl w:ilvl="1" w:tplc="B436E7F8">
       <w:start w:val="1"/>
       <w:numFmt w:val="bullet"/>
-      <w:lvlText w:val="○"/>
+      <w:lvlText w:val="–"/>
       <w:lvlJc w:val="left"/>
       <w:pPr>
-        <w:ind w:left="1440" w:hanging="360"/>
+        <w:ind w:left="900" w:hanging="280"/>
       </w:pPr>
     </w:lvl>
-    <w:lvl w:ilvl="2" w:tplc="35FA3434">
-      <w:start w:val="1"/>
-      <w:numFmt w:val="bullet"/>
-      <w:lvlText w:val="■"/>
+    <w:lvl w:ilvl="2" w:tplc="ACBC4682">
+      <w:numFmt w:val="decimal"/>
+      <w:lvlText w:val=""/>
       <w:lvlJc w:val="left"/>
-      <w:pPr>
-        <w:ind w:left="2160" w:hanging="360"/>
-      </w:pPr>
     </w:lvl>
-    <w:lvl w:ilvl="3" w:tplc="28CED90A">
-      <w:start w:val="1"/>
-      <w:numFmt w:val="bullet"/>
-      <w:lvlText w:val="●"/>
+    <w:lvl w:ilvl="3" w:tplc="7346CFBE">
+      <w:numFmt w:val="decimal"/>
+      <w:lvlText w:val=""/>
       <w:lvlJc w:val="left"/>
-      <w:pPr>
-        <w:ind w:left="2880" w:hanging="360"/>
-      </w:pPr>
     </w:lvl>
-    <w:lvl w:ilvl="4" w:tplc="D72C4DB0">
-      <w:start w:val="1"/>
-      <w:numFmt w:val="bullet"/>
-      <w:lvlText w:val="○"/>
+    <w:lvl w:ilvl="4" w:tplc="554C94E0">
+      <w:numFmt w:val="decimal"/>
+      <w:lvlText w:val=""/>
       <w:lvlJc w:val="left"/>
-      <w:pPr>
-        <w:ind w:left="3600" w:hanging="360"/>
-      </w:pPr>
     </w:lvl>
-    <w:lvl w:ilvl="5" w:tplc="A8E62044">
-      <w:start w:val="1"/>
-      <w:numFmt w:val="bullet"/>
-      <w:lvlText w:val="■"/>
+    <w:lvl w:ilvl="5" w:tplc="C706D3D2">
+      <w:numFmt w:val="decimal"/>
+      <w:lvlText w:val=""/>
       <w:lvlJc w:val="left"/>
-      <w:pPr>
-        <w:ind w:left="4320" w:hanging="360"/>
-      </w:pPr>
     </w:lvl>
-    <w:lvl w:ilvl="6" w:tplc="3A369188">
-      <w:start w:val="1"/>
-      <w:numFmt w:val="bullet"/>
-      <w:lvlText w:val="●"/>
+    <w:lvl w:ilvl="6" w:tplc="DC649718">
+      <w:numFmt w:val="decimal"/>
+      <w:lvlText w:val=""/>
       <w:lvlJc w:val="left"/>
-      <w:pPr>
-        <w:ind w:left="5040" w:hanging="360"/>
-      </w:pPr>
     </w:lvl>
-    <w:lvl w:ilvl="7" w:tplc="79AC58D2">
-      <w:start w:val="1"/>
-      <w:numFmt w:val="bullet"/>
-      <w:lvlText w:val="●"/>
+    <w:lvl w:ilvl="7" w:tplc="22989C40">
+      <w:numFmt w:val="decimal"/>
+      <w:lvlText w:val=""/>
       <w:lvlJc w:val="left"/>
-      <w:pPr>
-        <w:ind w:left="5760" w:hanging="360"/>
-      </w:pPr>
     </w:lvl>
-    <w:lvl w:ilvl="8" w:tplc="EAD801A6">
-      <w:start w:val="1"/>
-      <w:numFmt w:val="bullet"/>
-      <w:lvlText w:val="●"/>
+    <w:lvl w:ilvl="8" w:tplc="E4CADE7E">
+      <w:numFmt w:val="decimal"/>
+      <w:lvlText w:val=""/>
       <w:lvlJc w:val="left"/>
-      <w:pPr>
-        <w:ind w:left="6480" w:hanging="360"/>
-      </w:pPr>
     </w:lvl>
   </w:abstractNum>
-  <w:num w:numId="1" w16cid:durableId="1026978365">
+  <w:num w:numId="1" w16cid:durableId="82802347">
+    <w:abstractNumId w:val="1"/>
+    <w:lvlOverride w:ilvl="0">
+      <w:startOverride w:val="1"/>
+    </w:lvlOverride>
+  </w:num>
+  <w:num w:numId="2" w16cid:durableId="1325619834">
     <w:abstractNumId w:val="4"/>
     <w:lvlOverride w:ilvl="0">
       <w:startOverride w:val="1"/>
     </w:lvlOverride>
   </w:num>
-  <w:num w:numId="2" w16cid:durableId="1819608044">
+  <w:num w:numId="3" w16cid:durableId="256183280">
     <w:abstractNumId w:val="3"/>
     <w:lvlOverride w:ilvl="0">
       <w:startOverride w:val="1"/>
     </w:lvlOverride>
   </w:num>
-  <w:num w:numId="3" w16cid:durableId="1827241220">
+  <w:num w:numId="4" w16cid:durableId="117533591">
     <w:abstractNumId w:val="0"/>
     <w:lvlOverride w:ilvl="0">
       <w:startOverride w:val="1"/>
     </w:lvlOverride>
   </w:num>
-  <w:num w:numId="4" w16cid:durableId="610864706">
-    <w:abstractNumId w:val="1"/>
-    <w:lvlOverride w:ilvl="0">
-      <w:startOverride w:val="1"/>
-    </w:lvlOverride>
-  </w:num>
-  <w:num w:numId="5" w16cid:durableId="1337228825">
+  <w:num w:numId="5" w16cid:durableId="821122010">
     <w:abstractNumId w:val="2"/>
     <w:lvlOverride w:ilvl="0">
       <w:startOverride w:val="1"/>
@@ -6570,7 +6570,7 @@
     <w:autoRedefine/>
     <w:uiPriority w:val="39"/>
     <w:unhideWhenUsed/>
-    <w:rsid w:val="00E662BE"/>
+    <w:rsid w:val="00F602EC"/>
     <w:pPr>
       <w:spacing w:after="100"/>
     </w:pPr>
@@ -6582,7 +6582,7 @@
     <w:autoRedefine/>
     <w:uiPriority w:val="39"/>
     <w:unhideWhenUsed/>
-    <w:rsid w:val="00E662BE"/>
+    <w:rsid w:val="00F602EC"/>
     <w:pPr>
       <w:spacing w:after="100"/>
       <w:ind w:left="210"/>

</xml_diff>